<commit_message>
Update Onboarding Package with new Growth System pricing: Ripple 97/mo, Current 97/mo, Surge ,497/mo
</commit_message>
<xml_diff>
--- a/document/sales-agent-onboarding/document.docx
+++ b/document/sales-agent-onboarding/document.docx
@@ -952,7 +952,7 @@
                 <w:sz w:val="21"/>
                 <w:szCs w:val="21"/>
               </w:rPr>
-              <w:t xml:space="preserve">$1,800+</w:t>
+              <w:t xml:space="preserve">$397/mo + $900 setup</w:t>
             </w:r>
           </w:p>
         </w:tc>
@@ -1002,7 +1002,7 @@
                 <w:sz w:val="21"/>
                 <w:szCs w:val="21"/>
               </w:rPr>
-              <w:t xml:space="preserve">$360+</w:t>
+              <w:t xml:space="preserve">$79.40/mo + $180 setup</w:t>
             </w:r>
           </w:p>
         </w:tc>
@@ -1054,7 +1054,7 @@
                 <w:sz w:val="21"/>
                 <w:szCs w:val="21"/>
               </w:rPr>
-              <w:t xml:space="preserve">$3,000+</w:t>
+              <w:t xml:space="preserve">$697/mo + $1,250 setup</w:t>
             </w:r>
           </w:p>
         </w:tc>
@@ -1104,7 +1104,7 @@
                 <w:sz w:val="21"/>
                 <w:szCs w:val="21"/>
               </w:rPr>
-              <w:t xml:space="preserve">$600+</w:t>
+              <w:t xml:space="preserve">$139.40/mo + $250 setup</w:t>
             </w:r>
           </w:p>
         </w:tc>
@@ -1156,7 +1156,7 @@
                 <w:sz w:val="21"/>
                 <w:szCs w:val="21"/>
               </w:rPr>
-              <w:t xml:space="preserve">$5,000+</w:t>
+              <w:t xml:space="preserve">$1,497/mo + $2,500 setup</w:t>
             </w:r>
           </w:p>
         </w:tc>
@@ -1206,7 +1206,7 @@
                 <w:sz w:val="21"/>
                 <w:szCs w:val="21"/>
               </w:rPr>
-              <w:t xml:space="preserve">$1,000+</w:t>
+              <w:t xml:space="preserve">$299.40/mo + $500 setup</w:t>
             </w:r>
           </w:p>
         </w:tc>
@@ -3167,7 +3167,7 @@
                 <w:sz w:val="21"/>
                 <w:szCs w:val="21"/>
               </w:rPr>
-              <w:t xml:space="preserve">“I understand. Let me put it in perspective. A professional website alone costs $3,000 to $8,000 at most agencies and takes 6 to 12 weeks. With BluWav, you get the website, Google setup, WhatsApp integration, and a CRM trial — all in 48 hours, starting at $1,800. You are not paying more; you are getting more, faster.”</w:t>
+              <w:t xml:space="preserve">“I understand. Let me put it in perspective. A professional website alone costs $3,000 to $8,000 at most agencies and takes 6 to 12 weeks. With BluWav, you get the website, Google setup, WhatsApp integration, and a CRM trial — all in 48 hours, starting at $397/month. You are not paying more; you are getting more, faster.”</w:t>
             </w:r>
           </w:p>
         </w:tc>
@@ -3531,7 +3531,7 @@
                 <w:sz w:val="21"/>
                 <w:szCs w:val="21"/>
               </w:rPr>
-              <w:t xml:space="preserve">“That’s exactly who BluWav is built for. Our Ripple plan starts at $1,800 — it’s a one-time investment, you own everything forever, and it includes a 14-day free CRM trial. The Health Check just shows you where the biggest opportunity is for your specific business. No commitment.”</w:t>
+              <w:t xml:space="preserve">“That’s exactly who BluWav is built for. Our Ripple plan starts at $397/month — you own everything we build, forever, and it includes a 14-day free CRM trial. The Health Check just shows you where the biggest opportunity is for your specific business. No commitment.”</w:t>
             </w:r>
           </w:p>
         </w:tc>
@@ -3943,7 +3943,7 @@
           <w:sz w:val="24"/>
           <w:szCs w:val="24"/>
         </w:rPr>
-        <w:t xml:space="preserve">3 deals in Month 1 = $1,080 to $1,800 in commission, plus your performance bonus of $150. That is a strong start.</w:t>
+        <w:t xml:space="preserve">3 deals in Month 1 = $238 to $898 in monthly recurring commission, plus setup commissions and your performance bonus of $150. That is a strong start.</w:t>
       </w:r>
     </w:p>
     <w:p>

</xml_diff>

<commit_message>
Add residual commission column to Growth Systems pricing table in Onboarding Package
</commit_message>
<xml_diff>
--- a/document/sales-agent-onboarding/document.docx
+++ b/document/sales-agent-onboarding/document.docx
@@ -795,10 +795,11 @@
         </w:tblCellMar>
       </w:tblPr>
       <w:tblGrid>
-        <w:gridCol w:w="1560"/>
         <w:gridCol w:w="1200"/>
-        <w:gridCol w:w="4680"/>
-        <w:gridCol w:w="1920"/>
+        <w:gridCol w:w="1100"/>
+        <w:gridCol w:w="3960"/>
+        <w:gridCol w:w="1440"/>
+        <w:gridCol w:w="1200"/>
       </w:tblGrid>
       <w:tr>
         <w:trPr>
@@ -806,7 +807,7 @@
         </w:trPr>
         <w:tc>
           <w:tcPr>
-            <w:tcW w:type="dxa" w:w="1560"/>
+            <w:tcW w:type="dxa" w:w="1200"/>
             <w:tcBorders>
               <w:top w:val="none" w:color="FFFFFF" w:sz="0"/>
               <w:left w:val="none" w:color="FFFFFF" w:sz="0"/>
@@ -831,7 +832,7 @@
         </w:tc>
         <w:tc>
           <w:tcPr>
-            <w:tcW w:type="dxa" w:w="1200"/>
+            <w:tcW w:type="dxa" w:w="1100"/>
             <w:tcBorders>
               <w:top w:val="none" w:color="FFFFFF" w:sz="0"/>
               <w:left w:val="none" w:color="FFFFFF" w:sz="0"/>
@@ -856,7 +857,7 @@
         </w:tc>
         <w:tc>
           <w:tcPr>
-            <w:tcW w:type="dxa" w:w="4680"/>
+            <w:tcW w:type="dxa" w:w="3960"/>
             <w:tcBorders>
               <w:top w:val="none" w:color="FFFFFF" w:sz="0"/>
               <w:left w:val="none" w:color="FFFFFF" w:sz="0"/>
@@ -881,7 +882,7 @@
         </w:tc>
         <w:tc>
           <w:tcPr>
-            <w:tcW w:type="dxa" w:w="1920"/>
+            <w:tcW w:type="dxa" w:w="1440"/>
             <w:tcBorders>
               <w:top w:val="none" w:color="FFFFFF" w:sz="0"/>
               <w:left w:val="none" w:color="FFFFFF" w:sz="0"/>
@@ -900,22 +901,20 @@
                 <w:sz w:val="22"/>
                 <w:szCs w:val="22"/>
               </w:rPr>
-              <w:t xml:space="preserve">Your Commission</w:t>
-            </w:r>
-          </w:p>
-        </w:tc>
-      </w:tr>
-      <w:tr>
-        <w:tc>
-          <w:tcPr>
-            <w:tcW w:type="dxa" w:w="1560"/>
-            <w:tcBorders>
-              <w:top w:val="none" w:color="FFFFFF" w:sz="0"/>
-              <w:left w:val="none" w:color="FFFFFF" w:sz="0"/>
-              <w:bottom w:val="none" w:color="FFFFFF" w:sz="0"/>
-              <w:right w:val="none" w:color="FFFFFF" w:sz="0"/>
-            </w:tcBorders>
-            <w:shd w:fill="FFFFFF" w:color="auto" w:val="clear"/>
+              <w:t xml:space="preserve">Months 1–3 Commission</w:t>
+            </w:r>
+          </w:p>
+        </w:tc>
+        <w:tc>
+          <w:tcPr>
+            <w:tcW w:type="dxa" w:w="1200"/>
+            <w:tcBorders>
+              <w:top w:val="none" w:color="FFFFFF" w:sz="0"/>
+              <w:left w:val="none" w:color="FFFFFF" w:sz="0"/>
+              <w:bottom w:val="single" w:color="002B49" w:sz="6"/>
+              <w:right w:val="none" w:color="FFFFFF" w:sz="0"/>
+            </w:tcBorders>
+            <w:shd w:fill="EBF5FB" w:color="auto" w:val="clear"/>
           </w:tcPr>
           <w:p>
             <w:r>
@@ -924,6 +923,33 @@
                 <w:b/>
                 <w:bCs/>
                 <w:color w:val="002B49"/>
+                <w:sz w:val="22"/>
+                <w:szCs w:val="22"/>
+              </w:rPr>
+              <w:t xml:space="preserve">Residual After Month 3</w:t>
+            </w:r>
+          </w:p>
+        </w:tc>
+      </w:tr>
+      <w:tr>
+        <w:tc>
+          <w:tcPr>
+            <w:tcW w:type="dxa" w:w="1200"/>
+            <w:tcBorders>
+              <w:top w:val="none" w:color="FFFFFF" w:sz="0"/>
+              <w:left w:val="none" w:color="FFFFFF" w:sz="0"/>
+              <w:bottom w:val="none" w:color="FFFFFF" w:sz="0"/>
+              <w:right w:val="none" w:color="FFFFFF" w:sz="0"/>
+            </w:tcBorders>
+            <w:shd w:fill="FFFFFF" w:color="auto" w:val="clear"/>
+          </w:tcPr>
+          <w:p>
+            <w:r>
+              <w:rPr>
+                <w:rFonts w:ascii="Cambria" w:cs="Cambria" w:eastAsia="Cambria" w:hAnsi="Cambria"/>
+                <w:b/>
+                <w:bCs/>
+                <w:color w:val="002B49"/>
                 <w:sz w:val="21"/>
                 <w:szCs w:val="21"/>
               </w:rPr>
@@ -933,7 +959,7 @@
         </w:tc>
         <w:tc>
           <w:tcPr>
-            <w:tcW w:type="dxa" w:w="1200"/>
+            <w:tcW w:type="dxa" w:w="1100"/>
             <w:tcBorders>
               <w:top w:val="none" w:color="FFFFFF" w:sz="0"/>
               <w:left w:val="none" w:color="FFFFFF" w:sz="0"/>
@@ -958,7 +984,7 @@
         </w:tc>
         <w:tc>
           <w:tcPr>
-            <w:tcW w:type="dxa" w:w="4680"/>
+            <w:tcW w:type="dxa" w:w="3960"/>
             <w:tcBorders>
               <w:top w:val="none" w:color="FFFFFF" w:sz="0"/>
               <w:left w:val="none" w:color="FFFFFF" w:sz="0"/>
@@ -983,7 +1009,7 @@
         </w:tc>
         <w:tc>
           <w:tcPr>
-            <w:tcW w:type="dxa" w:w="1920"/>
+            <w:tcW w:type="dxa" w:w="1440"/>
             <w:tcBorders>
               <w:top w:val="none" w:color="FFFFFF" w:sz="0"/>
               <w:left w:val="none" w:color="FFFFFF" w:sz="0"/>
@@ -1006,11 +1032,36 @@
             </w:r>
           </w:p>
         </w:tc>
+        <w:tc>
+          <w:tcPr>
+            <w:tcW w:type="dxa" w:w="1200"/>
+            <w:tcBorders>
+              <w:top w:val="none" w:color="FFFFFF" w:sz="0"/>
+              <w:left w:val="none" w:color="FFFFFF" w:sz="0"/>
+              <w:bottom w:val="none" w:color="FFFFFF" w:sz="0"/>
+              <w:right w:val="none" w:color="FFFFFF" w:sz="0"/>
+            </w:tcBorders>
+            <w:shd w:fill="FFFFFF" w:color="auto" w:val="clear"/>
+          </w:tcPr>
+          <w:p>
+            <w:r>
+              <w:rPr>
+                <w:rFonts w:ascii="Cambria" w:cs="Cambria" w:eastAsia="Cambria" w:hAnsi="Cambria"/>
+                <w:b w:val="false"/>
+                <w:bCs w:val="false"/>
+                <w:color w:val="374151"/>
+                <w:sz w:val="21"/>
+                <w:szCs w:val="21"/>
+              </w:rPr>
+              <w:t xml:space="preserve">5% ($19.85/mo)</w:t>
+            </w:r>
+          </w:p>
+        </w:tc>
       </w:tr>
       <w:tr>
         <w:tc>
           <w:tcPr>
-            <w:tcW w:type="dxa" w:w="1560"/>
+            <w:tcW w:type="dxa" w:w="1200"/>
             <w:tcBorders>
               <w:top w:val="none" w:color="FFFFFF" w:sz="0"/>
               <w:left w:val="none" w:color="FFFFFF" w:sz="0"/>
@@ -1035,7 +1086,7 @@
         </w:tc>
         <w:tc>
           <w:tcPr>
-            <w:tcW w:type="dxa" w:w="1200"/>
+            <w:tcW w:type="dxa" w:w="1100"/>
             <w:tcBorders>
               <w:top w:val="none" w:color="FFFFFF" w:sz="0"/>
               <w:left w:val="none" w:color="FFFFFF" w:sz="0"/>
@@ -1060,7 +1111,7 @@
         </w:tc>
         <w:tc>
           <w:tcPr>
-            <w:tcW w:type="dxa" w:w="4680"/>
+            <w:tcW w:type="dxa" w:w="3960"/>
             <w:tcBorders>
               <w:top w:val="none" w:color="FFFFFF" w:sz="0"/>
               <w:left w:val="none" w:color="FFFFFF" w:sz="0"/>
@@ -1085,7 +1136,7 @@
         </w:tc>
         <w:tc>
           <w:tcPr>
-            <w:tcW w:type="dxa" w:w="1920"/>
+            <w:tcW w:type="dxa" w:w="1440"/>
             <w:tcBorders>
               <w:top w:val="none" w:color="FFFFFF" w:sz="0"/>
               <w:left w:val="none" w:color="FFFFFF" w:sz="0"/>
@@ -1108,11 +1159,36 @@
             </w:r>
           </w:p>
         </w:tc>
+        <w:tc>
+          <w:tcPr>
+            <w:tcW w:type="dxa" w:w="1200"/>
+            <w:tcBorders>
+              <w:top w:val="none" w:color="FFFFFF" w:sz="0"/>
+              <w:left w:val="none" w:color="FFFFFF" w:sz="0"/>
+              <w:bottom w:val="none" w:color="FFFFFF" w:sz="0"/>
+              <w:right w:val="none" w:color="FFFFFF" w:sz="0"/>
+            </w:tcBorders>
+            <w:shd w:fill="F8FBFF" w:color="auto" w:val="clear"/>
+          </w:tcPr>
+          <w:p>
+            <w:r>
+              <w:rPr>
+                <w:rFonts w:ascii="Cambria" w:cs="Cambria" w:eastAsia="Cambria" w:hAnsi="Cambria"/>
+                <w:b w:val="false"/>
+                <w:bCs w:val="false"/>
+                <w:color w:val="374151"/>
+                <w:sz w:val="21"/>
+                <w:szCs w:val="21"/>
+              </w:rPr>
+              <w:t xml:space="preserve">5% ($34.85/mo)</w:t>
+            </w:r>
+          </w:p>
+        </w:tc>
       </w:tr>
       <w:tr>
         <w:tc>
           <w:tcPr>
-            <w:tcW w:type="dxa" w:w="1560"/>
+            <w:tcW w:type="dxa" w:w="1200"/>
             <w:tcBorders>
               <w:top w:val="none" w:color="FFFFFF" w:sz="0"/>
               <w:left w:val="none" w:color="FFFFFF" w:sz="0"/>
@@ -1137,7 +1213,7 @@
         </w:tc>
         <w:tc>
           <w:tcPr>
-            <w:tcW w:type="dxa" w:w="1200"/>
+            <w:tcW w:type="dxa" w:w="1100"/>
             <w:tcBorders>
               <w:top w:val="none" w:color="FFFFFF" w:sz="0"/>
               <w:left w:val="none" w:color="FFFFFF" w:sz="0"/>
@@ -1162,7 +1238,7 @@
         </w:tc>
         <w:tc>
           <w:tcPr>
-            <w:tcW w:type="dxa" w:w="4680"/>
+            <w:tcW w:type="dxa" w:w="3960"/>
             <w:tcBorders>
               <w:top w:val="none" w:color="FFFFFF" w:sz="0"/>
               <w:left w:val="none" w:color="FFFFFF" w:sz="0"/>
@@ -1187,7 +1263,7 @@
         </w:tc>
         <w:tc>
           <w:tcPr>
-            <w:tcW w:type="dxa" w:w="1920"/>
+            <w:tcW w:type="dxa" w:w="1440"/>
             <w:tcBorders>
               <w:top w:val="none" w:color="FFFFFF" w:sz="0"/>
               <w:left w:val="none" w:color="FFFFFF" w:sz="0"/>
@@ -1207,6 +1283,31 @@
                 <w:szCs w:val="21"/>
               </w:rPr>
               <w:t xml:space="preserve">$299.40/mo + $500 setup</w:t>
+            </w:r>
+          </w:p>
+        </w:tc>
+        <w:tc>
+          <w:tcPr>
+            <w:tcW w:type="dxa" w:w="1200"/>
+            <w:tcBorders>
+              <w:top w:val="none" w:color="FFFFFF" w:sz="0"/>
+              <w:left w:val="none" w:color="FFFFFF" w:sz="0"/>
+              <w:bottom w:val="none" w:color="FFFFFF" w:sz="0"/>
+              <w:right w:val="none" w:color="FFFFFF" w:sz="0"/>
+            </w:tcBorders>
+            <w:shd w:fill="FFFFFF" w:color="auto" w:val="clear"/>
+          </w:tcPr>
+          <w:p>
+            <w:r>
+              <w:rPr>
+                <w:rFonts w:ascii="Cambria" w:cs="Cambria" w:eastAsia="Cambria" w:hAnsi="Cambria"/>
+                <w:b w:val="false"/>
+                <w:bCs w:val="false"/>
+                <w:color w:val="374151"/>
+                <w:sz w:val="21"/>
+                <w:szCs w:val="21"/>
+              </w:rPr>
+              <w:t xml:space="preserve">5% ($74.85/mo)</w:t>
             </w:r>
           </w:p>
         </w:tc>

</xml_diff>

<commit_message>
Expand Section 5 (Sales Scripts) and Section 6 (Objection Handler) in Onboarding Package
</commit_message>
<xml_diff>
--- a/document/sales-agent-onboarding/document.docx
+++ b/document/sales-agent-onboarding/document.docx
@@ -2890,7 +2890,7 @@
         <w:pageBreakBefore/>
       </w:pPr>
       <w:r>
-        <w:t xml:space="preserve">Section 5 — Sales Scripts</w:t>
+        <w:t xml:space="preserve">Section 5 \u2014 Sales Scripts</w:t>
       </w:r>
     </w:p>
     <w:p>
@@ -2933,7 +2933,7 @@
           <w:sz w:val="24"/>
           <w:szCs w:val="24"/>
         </w:rPr>
-        <w:t xml:space="preserve">“Hi [Name], I work with BluWav Growth. We help businesses like yours get found on Google, build a professional online presence, and automate customer follow-ups — all in one system. We deliver in 48 to 72 hours and you own everything we build. Would you be open to a quick conversation this week?”</w:t>
+        <w:t xml:space="preserve">“Hi [Name], I work with BluWav Growth. We help businesses get found online, get chosen by more customers, and grow through connected digital systems. Most businesses struggle because their website, Google profile, WhatsApp, and customer follow-up aren\u2019t working together. That\u2019s exactly what we fix. Are you open to a quick conversation this week?”</w:t>
       </w:r>
     </w:p>
     <w:p>
@@ -2946,18 +2946,7 @@
         <w:pStyle w:val="Heading2"/>
       </w:pPr>
       <w:r>
-        <w:t xml:space="preserve">Discovery Call Script</w:t>
-      </w:r>
-    </w:p>
-    <w:p>
-      <w:r>
-        <w:rPr>
-          <w:rFonts w:ascii="Cambria" w:cs="Cambria" w:eastAsia="Cambria" w:hAnsi="Cambria"/>
-          <w:color w:val="1E1E1E"/>
-          <w:sz w:val="24"/>
-          <w:szCs w:val="24"/>
-        </w:rPr>
-        <w:t xml:space="preserve">Open with a question, not a pitch:</w:t>
+        <w:t xml:space="preserve">Digital Health Check Script</w:t>
       </w:r>
     </w:p>
     <w:p>
@@ -2976,42 +2965,7 @@
           <w:sz w:val="24"/>
           <w:szCs w:val="24"/>
         </w:rPr>
-        <w:t xml:space="preserve">“Before I tell you about what we do, can I ask: when someone searches for [their business type] in [their area] on Google, do you show up? And if they find you, is your website doing anything to turn them into a customer?”</w:t>
-      </w:r>
-    </w:p>
-    <w:p>
-      <w:r>
-        <w:t xml:space="preserve"/>
-      </w:r>
-    </w:p>
-    <w:p>
-      <w:r>
-        <w:rPr>
-          <w:rFonts w:ascii="Cambria" w:cs="Cambria" w:eastAsia="Cambria" w:hAnsi="Cambria"/>
-          <w:color w:val="1E1E1E"/>
-          <w:sz w:val="24"/>
-          <w:szCs w:val="24"/>
-        </w:rPr>
-        <w:t xml:space="preserve">Listen to their answer. Then:</w:t>
-      </w:r>
-    </w:p>
-    <w:p>
-      <w:pPr>
-        <w:pBdr>
-          <w:left w:val="single" w:color="002B49" w:sz="8"/>
-        </w:pBdr>
-        <w:shd w:fill="F0F9FF" w:color="auto" w:val="clear"/>
-        <w:spacing w:after="80" w:before="80"/>
-        <w:ind w:left="480"/>
-      </w:pPr>
-      <w:r>
-        <w:rPr>
-          <w:rFonts w:ascii="Cambria" w:cs="Cambria" w:eastAsia="Cambria" w:hAnsi="Cambria"/>
-          <w:color w:val="002B49"/>
-          <w:sz w:val="24"/>
-          <w:szCs w:val="24"/>
-        </w:rPr>
-        <w:t xml:space="preserve">“That is exactly what we fix. BluWav builds the full system: your website, your Google visibility, your WhatsApp setup, and a CRM to track every lead. Most clients go live in 48 to 72 hours. You own everything we build — no lock-in, ever.”</w:t>
+        <w:t xml:space="preserve">“Before we talk about any package, I\u2019d love to send you our Free Digital Health Check. It only takes a couple of minutes to complete, and it identifies strengths, gaps, and opportunities across your online presence. There\u2019s no obligation and no commitment. It simply gives you clarity. Would you like the link?”</w:t>
       </w:r>
     </w:p>
     <w:p>
@@ -3024,26 +2978,18 @@
         <w:pStyle w:val="Heading2"/>
       </w:pPr>
       <w:r>
-        <w:t xml:space="preserve">CRM Introductory Rate Script</w:t>
-      </w:r>
-    </w:p>
-    <w:p>
-      <w:pPr>
-        <w:pBdr>
-          <w:left w:val="single" w:color="002B49" w:sz="8"/>
-        </w:pBdr>
-        <w:shd w:fill="F0F9FF" w:color="auto" w:val="clear"/>
-        <w:spacing w:after="80" w:before="80"/>
-        <w:ind w:left="480"/>
-      </w:pPr>
-      <w:r>
-        <w:rPr>
-          <w:rFonts w:ascii="Cambria" w:cs="Cambria" w:eastAsia="Cambria" w:hAnsi="Cambria"/>
-          <w:color w:val="002B49"/>
-          <w:sz w:val="24"/>
-          <w:szCs w:val="24"/>
-        </w:rPr>
-        <w:t xml:space="preserve">“Founder Plan™ is $199 per month. Unlimited contacts, full pipeline, WhatsApp integration, 5 team members, and all future features. Sign up today and get everything included from day one.”</w:t>
+        <w:t xml:space="preserve">Discovery Questions</w:t>
+      </w:r>
+    </w:p>
+    <w:p>
+      <w:r>
+        <w:rPr>
+          <w:rFonts w:ascii="Cambria" w:cs="Cambria" w:eastAsia="Cambria" w:hAnsi="Cambria"/>
+          <w:color w:val="1E1E1E"/>
+          <w:sz w:val="24"/>
+          <w:szCs w:val="24"/>
+        </w:rPr>
+        <w:t xml:space="preserve">Avoid pitching too early. Ask questions.</w:t>
       </w:r>
     </w:p>
     <w:p>
@@ -3056,26 +3002,79 @@
         <w:pStyle w:val="Heading2"/>
       </w:pPr>
       <w:r>
-        <w:t xml:space="preserve">Closing Script</w:t>
-      </w:r>
-    </w:p>
-    <w:p>
-      <w:pPr>
-        <w:pBdr>
-          <w:left w:val="single" w:color="002B49" w:sz="8"/>
-        </w:pBdr>
-        <w:shd w:fill="F0F9FF" w:color="auto" w:val="clear"/>
-        <w:spacing w:after="80" w:before="80"/>
-        <w:ind w:left="480"/>
-      </w:pPr>
-      <w:r>
-        <w:rPr>
-          <w:rFonts w:ascii="Cambria" w:cs="Cambria" w:eastAsia="Cambria" w:hAnsi="Cambria"/>
-          <w:color w:val="002B49"/>
-          <w:sz w:val="24"/>
-          <w:szCs w:val="24"/>
-        </w:rPr>
-        <w:t xml:space="preserve">“Based on what you have told me, I think [Launch™ / Momentum™ / Accelerate™] is the right fit. The investment is [price]. We start as soon as your invoice is paid, and you are live within 48 to 72 hours. Shall I send you the details?”</w:t>
+        <w:t xml:space="preserve">Visibility</w:t>
+      </w:r>
+    </w:p>
+    <w:p>
+      <w:pPr>
+        <w:pStyle w:val="ListParagraph"/>
+        <w:numPr>
+          <w:ilvl w:val="0"/>
+          <w:numId w:val="2"/>
+        </w:numPr>
+      </w:pPr>
+      <w:r>
+        <w:rPr>
+          <w:rFonts w:ascii="Cambria" w:cs="Cambria" w:eastAsia="Cambria" w:hAnsi="Cambria"/>
+          <w:color w:val="1E1E1E"/>
+          <w:sz w:val="24"/>
+          <w:szCs w:val="24"/>
+        </w:rPr>
+        <w:t xml:space="preserve">How do most customers find you today?</w:t>
+      </w:r>
+    </w:p>
+    <w:p>
+      <w:pPr>
+        <w:pStyle w:val="ListParagraph"/>
+        <w:numPr>
+          <w:ilvl w:val="0"/>
+          <w:numId w:val="2"/>
+        </w:numPr>
+      </w:pPr>
+      <w:r>
+        <w:rPr>
+          <w:rFonts w:ascii="Cambria" w:cs="Cambria" w:eastAsia="Cambria" w:hAnsi="Cambria"/>
+          <w:color w:val="1E1E1E"/>
+          <w:sz w:val="24"/>
+          <w:szCs w:val="24"/>
+        </w:rPr>
+        <w:t xml:space="preserve">Do you show up on Google when people search for your services?</w:t>
+      </w:r>
+    </w:p>
+    <w:p>
+      <w:pPr>
+        <w:pStyle w:val="ListParagraph"/>
+        <w:numPr>
+          <w:ilvl w:val="0"/>
+          <w:numId w:val="2"/>
+        </w:numPr>
+      </w:pPr>
+      <w:r>
+        <w:rPr>
+          <w:rFonts w:ascii="Cambria" w:cs="Cambria" w:eastAsia="Cambria" w:hAnsi="Cambria"/>
+          <w:color w:val="1E1E1E"/>
+          <w:sz w:val="24"/>
+          <w:szCs w:val="24"/>
+        </w:rPr>
+        <w:t xml:space="preserve">Are you happy with your Google Business Profile?</w:t>
+      </w:r>
+    </w:p>
+    <w:p>
+      <w:pPr>
+        <w:pStyle w:val="ListParagraph"/>
+        <w:numPr>
+          <w:ilvl w:val="0"/>
+          <w:numId w:val="2"/>
+        </w:numPr>
+      </w:pPr>
+      <w:r>
+        <w:rPr>
+          <w:rFonts w:ascii="Cambria" w:cs="Cambria" w:eastAsia="Cambria" w:hAnsi="Cambria"/>
+          <w:color w:val="1E1E1E"/>
+          <w:sz w:val="24"/>
+          <w:szCs w:val="24"/>
+        </w:rPr>
+        <w:t xml:space="preserve">How many online enquiries do you receive monthly?</w:t>
       </w:r>
     </w:p>
     <w:p>
@@ -3088,26 +3087,267 @@
         <w:pStyle w:val="Heading2"/>
       </w:pPr>
       <w:r>
-        <w:t xml:space="preserve">Free Health Check Script</w:t>
-      </w:r>
-    </w:p>
-    <w:p>
-      <w:pPr>
-        <w:pBdr>
-          <w:left w:val="single" w:color="002B49" w:sz="8"/>
-        </w:pBdr>
-        <w:shd w:fill="F0F9FF" w:color="auto" w:val="clear"/>
-        <w:spacing w:after="80" w:before="80"/>
-        <w:ind w:left="480"/>
-      </w:pPr>
-      <w:r>
-        <w:rPr>
-          <w:rFonts w:ascii="Cambria" w:cs="Cambria" w:eastAsia="Cambria" w:hAnsi="Cambria"/>
-          <w:color w:val="002B49"/>
-          <w:sz w:val="24"/>
-          <w:szCs w:val="24"/>
-        </w:rPr>
-        <w:t xml:space="preserve">“Before we go any further, let me offer you something completely free. It’s a short online form — takes two minutes — and it shows you exactly where your business stands online right now. No commitment, no sales pitch. Results come back within 24 hours. Want me to send you the link?”</w:t>
+        <w:t xml:space="preserve">Website</w:t>
+      </w:r>
+    </w:p>
+    <w:p>
+      <w:pPr>
+        <w:pStyle w:val="ListParagraph"/>
+        <w:numPr>
+          <w:ilvl w:val="0"/>
+          <w:numId w:val="3"/>
+        </w:numPr>
+      </w:pPr>
+      <w:r>
+        <w:rPr>
+          <w:rFonts w:ascii="Cambria" w:cs="Cambria" w:eastAsia="Cambria" w:hAnsi="Cambria"/>
+          <w:color w:val="1E1E1E"/>
+          <w:sz w:val="24"/>
+          <w:szCs w:val="24"/>
+        </w:rPr>
+        <w:t xml:space="preserve">When was your website last updated?</w:t>
+      </w:r>
+    </w:p>
+    <w:p>
+      <w:pPr>
+        <w:pStyle w:val="ListParagraph"/>
+        <w:numPr>
+          <w:ilvl w:val="0"/>
+          <w:numId w:val="3"/>
+        </w:numPr>
+      </w:pPr>
+      <w:r>
+        <w:rPr>
+          <w:rFonts w:ascii="Cambria" w:cs="Cambria" w:eastAsia="Cambria" w:hAnsi="Cambria"/>
+          <w:color w:val="1E1E1E"/>
+          <w:sz w:val="24"/>
+          <w:szCs w:val="24"/>
+        </w:rPr>
+        <w:t xml:space="preserve">Do you know how many leads come from your website?</w:t>
+      </w:r>
+    </w:p>
+    <w:p>
+      <w:pPr>
+        <w:pStyle w:val="ListParagraph"/>
+        <w:numPr>
+          <w:ilvl w:val="0"/>
+          <w:numId w:val="3"/>
+        </w:numPr>
+      </w:pPr>
+      <w:r>
+        <w:rPr>
+          <w:rFonts w:ascii="Cambria" w:cs="Cambria" w:eastAsia="Cambria" w:hAnsi="Cambria"/>
+          <w:color w:val="1E1E1E"/>
+          <w:sz w:val="24"/>
+          <w:szCs w:val="24"/>
+        </w:rPr>
+        <w:t xml:space="preserve">Is your website mobile-friendly?</w:t>
+      </w:r>
+    </w:p>
+    <w:p>
+      <w:r>
+        <w:t xml:space="preserve"/>
+      </w:r>
+    </w:p>
+    <w:p>
+      <w:pPr>
+        <w:pStyle w:val="Heading2"/>
+      </w:pPr>
+      <w:r>
+        <w:t xml:space="preserve">Follow-Up</w:t>
+      </w:r>
+    </w:p>
+    <w:p>
+      <w:pPr>
+        <w:pStyle w:val="ListParagraph"/>
+        <w:numPr>
+          <w:ilvl w:val="0"/>
+          <w:numId w:val="4"/>
+        </w:numPr>
+      </w:pPr>
+      <w:r>
+        <w:rPr>
+          <w:rFonts w:ascii="Cambria" w:cs="Cambria" w:eastAsia="Cambria" w:hAnsi="Cambria"/>
+          <w:color w:val="1E1E1E"/>
+          <w:sz w:val="24"/>
+          <w:szCs w:val="24"/>
+        </w:rPr>
+        <w:t xml:space="preserve">What happens after someone contacts you?</w:t>
+      </w:r>
+    </w:p>
+    <w:p>
+      <w:pPr>
+        <w:pStyle w:val="ListParagraph"/>
+        <w:numPr>
+          <w:ilvl w:val="0"/>
+          <w:numId w:val="4"/>
+        </w:numPr>
+      </w:pPr>
+      <w:r>
+        <w:rPr>
+          <w:rFonts w:ascii="Cambria" w:cs="Cambria" w:eastAsia="Cambria" w:hAnsi="Cambria"/>
+          <w:color w:val="1E1E1E"/>
+          <w:sz w:val="24"/>
+          <w:szCs w:val="24"/>
+        </w:rPr>
+        <w:t xml:space="preserve">How quickly do you respond to enquiries?</w:t>
+      </w:r>
+    </w:p>
+    <w:p>
+      <w:pPr>
+        <w:pStyle w:val="ListParagraph"/>
+        <w:numPr>
+          <w:ilvl w:val="0"/>
+          <w:numId w:val="4"/>
+        </w:numPr>
+      </w:pPr>
+      <w:r>
+        <w:rPr>
+          <w:rFonts w:ascii="Cambria" w:cs="Cambria" w:eastAsia="Cambria" w:hAnsi="Cambria"/>
+          <w:color w:val="1E1E1E"/>
+          <w:sz w:val="24"/>
+          <w:szCs w:val="24"/>
+        </w:rPr>
+        <w:t xml:space="preserve">Do you have a system for following up with leads?</w:t>
+      </w:r>
+    </w:p>
+    <w:p>
+      <w:r>
+        <w:t xml:space="preserve"/>
+      </w:r>
+    </w:p>
+    <w:p>
+      <w:pPr>
+        <w:pStyle w:val="Heading2"/>
+      </w:pPr>
+      <w:r>
+        <w:t xml:space="preserve">CRM</w:t>
+      </w:r>
+    </w:p>
+    <w:p>
+      <w:pPr>
+        <w:pStyle w:val="ListParagraph"/>
+        <w:numPr>
+          <w:ilvl w:val="0"/>
+          <w:numId w:val="5"/>
+        </w:numPr>
+      </w:pPr>
+      <w:r>
+        <w:rPr>
+          <w:rFonts w:ascii="Cambria" w:cs="Cambria" w:eastAsia="Cambria" w:hAnsi="Cambria"/>
+          <w:color w:val="1E1E1E"/>
+          <w:sz w:val="24"/>
+          <w:szCs w:val="24"/>
+        </w:rPr>
+        <w:t xml:space="preserve">Where do you currently keep customer information?</w:t>
+      </w:r>
+    </w:p>
+    <w:p>
+      <w:pPr>
+        <w:pStyle w:val="ListParagraph"/>
+        <w:numPr>
+          <w:ilvl w:val="0"/>
+          <w:numId w:val="5"/>
+        </w:numPr>
+      </w:pPr>
+      <w:r>
+        <w:rPr>
+          <w:rFonts w:ascii="Cambria" w:cs="Cambria" w:eastAsia="Cambria" w:hAnsi="Cambria"/>
+          <w:color w:val="1E1E1E"/>
+          <w:sz w:val="24"/>
+          <w:szCs w:val="24"/>
+        </w:rPr>
+        <w:t xml:space="preserve">How do you track opportunities?</w:t>
+      </w:r>
+    </w:p>
+    <w:p>
+      <w:pPr>
+        <w:pStyle w:val="ListParagraph"/>
+        <w:numPr>
+          <w:ilvl w:val="0"/>
+          <w:numId w:val="5"/>
+        </w:numPr>
+      </w:pPr>
+      <w:r>
+        <w:rPr>
+          <w:rFonts w:ascii="Cambria" w:cs="Cambria" w:eastAsia="Cambria" w:hAnsi="Cambria"/>
+          <w:color w:val="1E1E1E"/>
+          <w:sz w:val="24"/>
+          <w:szCs w:val="24"/>
+        </w:rPr>
+        <w:t xml:space="preserve">Have you ever lost a customer because someone forgot to follow up?</w:t>
+      </w:r>
+    </w:p>
+    <w:p>
+      <w:r>
+        <w:t xml:space="preserve"/>
+      </w:r>
+    </w:p>
+    <w:p>
+      <w:pPr>
+        <w:pStyle w:val="Heading2"/>
+      </w:pPr>
+      <w:r>
+        <w:t xml:space="preserve">Growth Goals</w:t>
+      </w:r>
+    </w:p>
+    <w:p>
+      <w:pPr>
+        <w:pStyle w:val="ListParagraph"/>
+        <w:numPr>
+          <w:ilvl w:val="0"/>
+          <w:numId w:val="6"/>
+        </w:numPr>
+      </w:pPr>
+      <w:r>
+        <w:rPr>
+          <w:rFonts w:ascii="Cambria" w:cs="Cambria" w:eastAsia="Cambria" w:hAnsi="Cambria"/>
+          <w:color w:val="1E1E1E"/>
+          <w:sz w:val="24"/>
+          <w:szCs w:val="24"/>
+        </w:rPr>
+        <w:t xml:space="preserve">What are your growth goals over the next 12 months?</w:t>
+      </w:r>
+    </w:p>
+    <w:p>
+      <w:pPr>
+        <w:pStyle w:val="ListParagraph"/>
+        <w:numPr>
+          <w:ilvl w:val="0"/>
+          <w:numId w:val="6"/>
+        </w:numPr>
+      </w:pPr>
+      <w:r>
+        <w:rPr>
+          <w:rFonts w:ascii="Cambria" w:cs="Cambria" w:eastAsia="Cambria" w:hAnsi="Cambria"/>
+          <w:color w:val="1E1E1E"/>
+          <w:sz w:val="24"/>
+          <w:szCs w:val="24"/>
+        </w:rPr>
+        <w:t xml:space="preserve">If you could fix one thing about your marketing, what would it be?</w:t>
+      </w:r>
+    </w:p>
+    <w:p>
+      <w:pPr>
+        <w:pStyle w:val="ListParagraph"/>
+        <w:numPr>
+          <w:ilvl w:val="0"/>
+          <w:numId w:val="6"/>
+        </w:numPr>
+      </w:pPr>
+      <w:r>
+        <w:rPr>
+          <w:rFonts w:ascii="Cambria" w:cs="Cambria" w:eastAsia="Cambria" w:hAnsi="Cambria"/>
+          <w:color w:val="1E1E1E"/>
+          <w:sz w:val="24"/>
+          <w:szCs w:val="24"/>
+        </w:rPr>
+        <w:t xml:space="preserve">What\u2019s stopping growth today?</w:t>
+      </w:r>
+    </w:p>
+    <w:p>
+      <w:r>
+        <w:t xml:space="preserve"/>
       </w:r>
     </w:p>
     <w:p>
@@ -3127,6 +3367,629 @@
           <w:sz w:val="22"/>
           <w:szCs w:val="22"/>
         </w:rPr>
+        <w:t xml:space="preserve">These questions line up directly with BluWav\u2019s visibility, credibility, conversion, and systems pillars.</w:t>
+      </w:r>
+    </w:p>
+    <w:p>
+      <w:r>
+        <w:t xml:space="preserve"/>
+      </w:r>
+    </w:p>
+    <w:p>
+      <w:pPr>
+        <w:pStyle w:val="Heading2"/>
+      </w:pPr>
+      <w:r>
+        <w:t xml:space="preserve">Growth Sprint Script</w:t>
+      </w:r>
+    </w:p>
+    <w:p>
+      <w:r>
+        <w:rPr>
+          <w:rFonts w:ascii="Cambria" w:cs="Cambria" w:eastAsia="Cambria" w:hAnsi="Cambria"/>
+          <w:color w:val="1E1E1E"/>
+          <w:sz w:val="24"/>
+          <w:szCs w:val="24"/>
+        </w:rPr>
+        <w:t xml:space="preserve">For prospects who are unsure what they need:</w:t>
+      </w:r>
+    </w:p>
+    <w:p>
+      <w:pPr>
+        <w:pBdr>
+          <w:left w:val="single" w:color="002B49" w:sz="8"/>
+        </w:pBdr>
+        <w:shd w:fill="F0F9FF" w:color="auto" w:val="clear"/>
+        <w:spacing w:after="80" w:before="80"/>
+        <w:ind w:left="480"/>
+      </w:pPr>
+      <w:r>
+        <w:rPr>
+          <w:rFonts w:ascii="Cambria" w:cs="Cambria" w:eastAsia="Cambria" w:hAnsi="Cambria"/>
+          <w:color w:val="002B49"/>
+          <w:sz w:val="24"/>
+          <w:szCs w:val="24"/>
+        </w:rPr>
+        <w:t xml:space="preserve">“Based on our conversation, I don\u2019t think the first step is choosing a package. I think the first step is clarity. That\u2019s exactly why we created the 30-Day Growth Sprint.”</w:t>
+      </w:r>
+    </w:p>
+    <w:p>
+      <w:r>
+        <w:t xml:space="preserve"/>
+      </w:r>
+    </w:p>
+    <w:p>
+      <w:pPr>
+        <w:pBdr>
+          <w:left w:val="single" w:color="002B49" w:sz="8"/>
+        </w:pBdr>
+        <w:shd w:fill="F0F9FF" w:color="auto" w:val="clear"/>
+        <w:spacing w:after="80" w:before="80"/>
+        <w:ind w:left="480"/>
+      </w:pPr>
+      <w:r>
+        <w:rPr>
+          <w:rFonts w:ascii="Cambria" w:cs="Cambria" w:eastAsia="Cambria" w:hAnsi="Cambria"/>
+          <w:color w:val="002B49"/>
+          <w:sz w:val="24"/>
+          <w:szCs w:val="24"/>
+        </w:rPr>
+        <w:t xml:space="preserve">“Over 30 days, we assess where your business is today, identify opportunities, build a practical roadmap, and help you prioritize what matters most. Then you can decide whether Launch™, Momentum™, Accelerate™, or a CRM plan makes sense.”</w:t>
+      </w:r>
+    </w:p>
+    <w:p>
+      <w:r>
+        <w:t xml:space="preserve"/>
+      </w:r>
+    </w:p>
+    <w:p>
+      <w:pPr>
+        <w:pBdr>
+          <w:left w:val="single" w:color="002B49" w:sz="8"/>
+        </w:pBdr>
+        <w:shd w:fill="F0F9FF" w:color="auto" w:val="clear"/>
+        <w:spacing w:after="80" w:before="80"/>
+        <w:ind w:left="480"/>
+      </w:pPr>
+      <w:r>
+        <w:rPr>
+          <w:rFonts w:ascii="Cambria" w:cs="Cambria" w:eastAsia="Cambria" w:hAnsi="Cambria"/>
+          <w:color w:val="002B49"/>
+          <w:sz w:val="24"/>
+          <w:szCs w:val="24"/>
+        </w:rPr>
+        <w:t xml:space="preserve">“The investment is $2,500 and gives you a clear growth plan instead of guesswork.”</w:t>
+      </w:r>
+    </w:p>
+    <w:p>
+      <w:r>
+        <w:t xml:space="preserve"/>
+      </w:r>
+    </w:p>
+    <w:p>
+      <w:pPr>
+        <w:pStyle w:val="Heading2"/>
+      </w:pPr>
+      <w:r>
+        <w:t xml:space="preserve">Launch™ Script</w:t>
+      </w:r>
+    </w:p>
+    <w:p>
+      <w:pPr>
+        <w:pBdr>
+          <w:left w:val="single" w:color="002B49" w:sz="8"/>
+        </w:pBdr>
+        <w:shd w:fill="F0F9FF" w:color="auto" w:val="clear"/>
+        <w:spacing w:after="80" w:before="80"/>
+        <w:ind w:left="480"/>
+      </w:pPr>
+      <w:r>
+        <w:rPr>
+          <w:rFonts w:ascii="Cambria" w:cs="Cambria" w:eastAsia="Cambria" w:hAnsi="Cambria"/>
+          <w:color w:val="002B49"/>
+          <w:sz w:val="24"/>
+          <w:szCs w:val="24"/>
+        </w:rPr>
+        <w:t xml:space="preserve">“Launch™ is designed for businesses that need a professional presence and a stronger online foundation.”</w:t>
+      </w:r>
+    </w:p>
+    <w:p>
+      <w:r>
+        <w:t xml:space="preserve"/>
+      </w:r>
+    </w:p>
+    <w:p>
+      <w:pPr>
+        <w:pBdr>
+          <w:left w:val="single" w:color="002B49" w:sz="8"/>
+        </w:pBdr>
+        <w:shd w:fill="F0F9FF" w:color="auto" w:val="clear"/>
+        <w:spacing w:after="80" w:before="80"/>
+        <w:ind w:left="480"/>
+      </w:pPr>
+      <w:r>
+        <w:rPr>
+          <w:rFonts w:ascii="Cambria" w:cs="Cambria" w:eastAsia="Cambria" w:hAnsi="Cambria"/>
+          <w:color w:val="002B49"/>
+          <w:sz w:val="24"/>
+          <w:szCs w:val="24"/>
+        </w:rPr>
+        <w:t xml:space="preserve">“You get a modern website, Google Business Profile optimization, SEO foundations, WhatsApp integration, automation, performance reporting, and a free CRM trial.”</w:t>
+      </w:r>
+    </w:p>
+    <w:p>
+      <w:r>
+        <w:t xml:space="preserve"/>
+      </w:r>
+    </w:p>
+    <w:p>
+      <w:pPr>
+        <w:pBdr>
+          <w:left w:val="single" w:color="002B49" w:sz="8"/>
+        </w:pBdr>
+        <w:shd w:fill="F0F9FF" w:color="auto" w:val="clear"/>
+        <w:spacing w:after="80" w:before="80"/>
+        <w:ind w:left="480"/>
+      </w:pPr>
+      <w:r>
+        <w:rPr>
+          <w:rFonts w:ascii="Cambria" w:cs="Cambria" w:eastAsia="Cambria" w:hAnsi="Cambria"/>
+          <w:color w:val="002B49"/>
+          <w:sz w:val="24"/>
+          <w:szCs w:val="24"/>
+        </w:rPr>
+        <w:t xml:space="preserve">“For many clients, Launch™ is the fastest path from invisible to visible.”</w:t>
+      </w:r>
+    </w:p>
+    <w:p>
+      <w:r>
+        <w:t xml:space="preserve"/>
+      </w:r>
+    </w:p>
+    <w:p>
+      <w:pPr>
+        <w:pStyle w:val="Heading2"/>
+      </w:pPr>
+      <w:r>
+        <w:t xml:space="preserve">Momentum™ Script</w:t>
+      </w:r>
+    </w:p>
+    <w:p>
+      <w:pPr>
+        <w:pBdr>
+          <w:left w:val="single" w:color="002B49" w:sz="8"/>
+        </w:pBdr>
+        <w:shd w:fill="F0F9FF" w:color="auto" w:val="clear"/>
+        <w:spacing w:after="80" w:before="80"/>
+        <w:ind w:left="480"/>
+      </w:pPr>
+      <w:r>
+        <w:rPr>
+          <w:rFonts w:ascii="Cambria" w:cs="Cambria" w:eastAsia="Cambria" w:hAnsi="Cambria"/>
+          <w:color w:val="002B49"/>
+          <w:sz w:val="24"/>
+          <w:szCs w:val="24"/>
+        </w:rPr>
+        <w:t xml:space="preserve">“Momentum™ is our most popular package because it moves beyond visibility and focuses on consistent lead generation.”</w:t>
+      </w:r>
+    </w:p>
+    <w:p>
+      <w:r>
+        <w:t xml:space="preserve"/>
+      </w:r>
+    </w:p>
+    <w:p>
+      <w:pPr>
+        <w:pBdr>
+          <w:left w:val="single" w:color="002B49" w:sz="8"/>
+        </w:pBdr>
+        <w:shd w:fill="F0F9FF" w:color="auto" w:val="clear"/>
+        <w:spacing w:after="80" w:before="80"/>
+        <w:ind w:left="480"/>
+      </w:pPr>
+      <w:r>
+        <w:rPr>
+          <w:rFonts w:ascii="Cambria" w:cs="Cambria" w:eastAsia="Cambria" w:hAnsi="Cambria"/>
+          <w:color w:val="002B49"/>
+          <w:sz w:val="24"/>
+          <w:szCs w:val="24"/>
+        </w:rPr>
+        <w:t xml:space="preserve">“In addition to everything in Launch™, you get advanced lead nurturing, conversion-focused landing pages, reputation management, competitor analysis, and stronger local SEO.”</w:t>
+      </w:r>
+    </w:p>
+    <w:p>
+      <w:r>
+        <w:t xml:space="preserve"/>
+      </w:r>
+    </w:p>
+    <w:p>
+      <w:pPr>
+        <w:pBdr>
+          <w:left w:val="single" w:color="002B49" w:sz="8"/>
+        </w:pBdr>
+        <w:shd w:fill="F0F9FF" w:color="auto" w:val="clear"/>
+        <w:spacing w:after="80" w:before="80"/>
+        <w:ind w:left="480"/>
+      </w:pPr>
+      <w:r>
+        <w:rPr>
+          <w:rFonts w:ascii="Cambria" w:cs="Cambria" w:eastAsia="Cambria" w:hAnsi="Cambria"/>
+          <w:color w:val="002B49"/>
+          <w:sz w:val="24"/>
+          <w:szCs w:val="24"/>
+        </w:rPr>
+        <w:t xml:space="preserve">“It\u2019s ideal for businesses ready to grow consistently, not just look professional.”</w:t>
+      </w:r>
+    </w:p>
+    <w:p>
+      <w:r>
+        <w:t xml:space="preserve"/>
+      </w:r>
+    </w:p>
+    <w:p>
+      <w:pPr>
+        <w:pStyle w:val="Heading2"/>
+      </w:pPr>
+      <w:r>
+        <w:t xml:space="preserve">Accelerate™ Script</w:t>
+      </w:r>
+    </w:p>
+    <w:p>
+      <w:pPr>
+        <w:pBdr>
+          <w:left w:val="single" w:color="002B49" w:sz="8"/>
+        </w:pBdr>
+        <w:shd w:fill="F0F9FF" w:color="auto" w:val="clear"/>
+        <w:spacing w:after="80" w:before="80"/>
+        <w:ind w:left="480"/>
+      </w:pPr>
+      <w:r>
+        <w:rPr>
+          <w:rFonts w:ascii="Cambria" w:cs="Cambria" w:eastAsia="Cambria" w:hAnsi="Cambria"/>
+          <w:color w:val="002B49"/>
+          <w:sz w:val="24"/>
+          <w:szCs w:val="24"/>
+        </w:rPr>
+        <w:t xml:space="preserve">“Accelerate™ is for businesses with aggressive growth goals.”</w:t>
+      </w:r>
+    </w:p>
+    <w:p>
+      <w:r>
+        <w:t xml:space="preserve"/>
+      </w:r>
+    </w:p>
+    <w:p>
+      <w:pPr>
+        <w:pBdr>
+          <w:left w:val="single" w:color="002B49" w:sz="8"/>
+        </w:pBdr>
+        <w:shd w:fill="F0F9FF" w:color="auto" w:val="clear"/>
+        <w:spacing w:after="80" w:before="80"/>
+        <w:ind w:left="480"/>
+      </w:pPr>
+      <w:r>
+        <w:rPr>
+          <w:rFonts w:ascii="Cambria" w:cs="Cambria" w:eastAsia="Cambria" w:hAnsi="Cambria"/>
+          <w:color w:val="002B49"/>
+          <w:sz w:val="24"/>
+          <w:szCs w:val="24"/>
+        </w:rPr>
+        <w:t xml:space="preserve">“It includes everything in Momentum™, plus advertising setup, advanced funnel automation, strategic reporting, dedicated support, and quarterly reviews.”</w:t>
+      </w:r>
+    </w:p>
+    <w:p>
+      <w:r>
+        <w:t xml:space="preserve"/>
+      </w:r>
+    </w:p>
+    <w:p>
+      <w:pPr>
+        <w:pBdr>
+          <w:left w:val="single" w:color="002B49" w:sz="8"/>
+        </w:pBdr>
+        <w:shd w:fill="F0F9FF" w:color="auto" w:val="clear"/>
+        <w:spacing w:after="80" w:before="80"/>
+        <w:ind w:left="480"/>
+      </w:pPr>
+      <w:r>
+        <w:rPr>
+          <w:rFonts w:ascii="Cambria" w:cs="Cambria" w:eastAsia="Cambria" w:hAnsi="Cambria"/>
+          <w:color w:val="002B49"/>
+          <w:sz w:val="24"/>
+          <w:szCs w:val="24"/>
+        </w:rPr>
+        <w:t xml:space="preserve">“If Launch™ gets you visible and Momentum™ gets you growing, Accelerate™ is designed to accelerate growth.”</w:t>
+      </w:r>
+    </w:p>
+    <w:p>
+      <w:r>
+        <w:t xml:space="preserve"/>
+      </w:r>
+    </w:p>
+    <w:p>
+      <w:pPr>
+        <w:pStyle w:val="Heading2"/>
+      </w:pPr>
+      <w:r>
+        <w:t xml:space="preserve">CRM Standalone Script</w:t>
+      </w:r>
+    </w:p>
+    <w:p>
+      <w:pPr>
+        <w:pBdr>
+          <w:left w:val="single" w:color="002B49" w:sz="8"/>
+        </w:pBdr>
+        <w:shd w:fill="F0F9FF" w:color="auto" w:val="clear"/>
+        <w:spacing w:after="80" w:before="80"/>
+        <w:ind w:left="480"/>
+      </w:pPr>
+      <w:r>
+        <w:rPr>
+          <w:rFonts w:ascii="Cambria" w:cs="Cambria" w:eastAsia="Cambria" w:hAnsi="Cambria"/>
+          <w:color w:val="002B49"/>
+          <w:sz w:val="24"/>
+          <w:szCs w:val="24"/>
+        </w:rPr>
+        <w:t xml:space="preserve">“A lot of business owners think they need more leads. What they actually need is better follow-up.”</w:t>
+      </w:r>
+    </w:p>
+    <w:p>
+      <w:r>
+        <w:t xml:space="preserve"/>
+      </w:r>
+    </w:p>
+    <w:p>
+      <w:pPr>
+        <w:pBdr>
+          <w:left w:val="single" w:color="002B49" w:sz="8"/>
+        </w:pBdr>
+        <w:shd w:fill="F0F9FF" w:color="auto" w:val="clear"/>
+        <w:spacing w:after="80" w:before="80"/>
+        <w:ind w:left="480"/>
+      </w:pPr>
+      <w:r>
+        <w:rPr>
+          <w:rFonts w:ascii="Cambria" w:cs="Cambria" w:eastAsia="Cambria" w:hAnsi="Cambria"/>
+          <w:color w:val="002B49"/>
+          <w:sz w:val="24"/>
+          <w:szCs w:val="24"/>
+        </w:rPr>
+        <w:t xml:space="preserve">“The BluWav CRM helps you organize contacts, automate follow-up, manage opportunities, and track every customer interaction.”</w:t>
+      </w:r>
+    </w:p>
+    <w:p>
+      <w:r>
+        <w:t xml:space="preserve"/>
+      </w:r>
+    </w:p>
+    <w:p>
+      <w:pPr>
+        <w:pBdr>
+          <w:left w:val="single" w:color="002B49" w:sz="8"/>
+        </w:pBdr>
+        <w:shd w:fill="F0F9FF" w:color="auto" w:val="clear"/>
+        <w:spacing w:after="80" w:before="80"/>
+        <w:ind w:left="480"/>
+      </w:pPr>
+      <w:r>
+        <w:rPr>
+          <w:rFonts w:ascii="Cambria" w:cs="Cambria" w:eastAsia="Cambria" w:hAnsi="Cambria"/>
+          <w:color w:val="002B49"/>
+          <w:sz w:val="24"/>
+          <w:szCs w:val="24"/>
+        </w:rPr>
+        <w:t xml:space="preserve">“It\u2019s often the fastest way to improve results without spending more money on marketing.”</w:t>
+      </w:r>
+    </w:p>
+    <w:p>
+      <w:r>
+        <w:t xml:space="preserve"/>
+      </w:r>
+    </w:p>
+    <w:p>
+      <w:pPr>
+        <w:pStyle w:val="Heading2"/>
+      </w:pPr>
+      <w:r>
+        <w:t xml:space="preserve">Upsell Script</w:t>
+      </w:r>
+    </w:p>
+    <w:p>
+      <w:pPr>
+        <w:pBdr>
+          <w:left w:val="single" w:color="002B49" w:sz="8"/>
+        </w:pBdr>
+        <w:shd w:fill="F0F9FF" w:color="auto" w:val="clear"/>
+        <w:spacing w:after="80" w:before="80"/>
+        <w:ind w:left="480"/>
+      </w:pPr>
+      <w:r>
+        <w:rPr>
+          <w:rFonts w:ascii="Cambria" w:cs="Cambria" w:eastAsia="Cambria" w:hAnsi="Cambria"/>
+          <w:color w:val="002B49"/>
+          <w:sz w:val="24"/>
+          <w:szCs w:val="24"/>
+        </w:rPr>
+        <w:t xml:space="preserve">“Before we finalize, let me ask one question.”</w:t>
+      </w:r>
+    </w:p>
+    <w:p>
+      <w:r>
+        <w:t xml:space="preserve"/>
+      </w:r>
+    </w:p>
+    <w:p>
+      <w:pPr>
+        <w:pBdr>
+          <w:left w:val="single" w:color="002B49" w:sz="8"/>
+        </w:pBdr>
+        <w:shd w:fill="F0F9FF" w:color="auto" w:val="clear"/>
+        <w:spacing w:after="80" w:before="80"/>
+        <w:ind w:left="480"/>
+      </w:pPr>
+      <w:r>
+        <w:rPr>
+          <w:rFonts w:ascii="Cambria" w:cs="Cambria" w:eastAsia="Cambria" w:hAnsi="Cambria"/>
+          <w:color w:val="002B49"/>
+          <w:sz w:val="24"/>
+          <w:szCs w:val="24"/>
+        </w:rPr>
+        <w:t xml:space="preserve">“If Launch™ helps you get found online, what happens after those new leads start coming in?”</w:t>
+      </w:r>
+    </w:p>
+    <w:p>
+      <w:r>
+        <w:t xml:space="preserve"/>
+      </w:r>
+    </w:p>
+    <w:p>
+      <w:pPr>
+        <w:pBdr>
+          <w:left w:val="single" w:color="002B49" w:sz="8"/>
+        </w:pBdr>
+        <w:shd w:fill="F0F9FF" w:color="auto" w:val="clear"/>
+        <w:spacing w:after="80" w:before="80"/>
+        <w:ind w:left="480"/>
+      </w:pPr>
+      <w:r>
+        <w:rPr>
+          <w:rFonts w:ascii="Cambria" w:cs="Cambria" w:eastAsia="Cambria" w:hAnsi="Cambria"/>
+          <w:color w:val="002B49"/>
+          <w:sz w:val="24"/>
+          <w:szCs w:val="24"/>
+        </w:rPr>
+        <w:t xml:space="preserve">“That\u2019s why most clients add the CRM. It ensures every lead is captured, followed up, and tracked.”</w:t>
+      </w:r>
+    </w:p>
+    <w:p>
+      <w:r>
+        <w:t xml:space="preserve"/>
+      </w:r>
+    </w:p>
+    <w:p>
+      <w:pPr>
+        <w:pStyle w:val="Heading2"/>
+      </w:pPr>
+      <w:r>
+        <w:t xml:space="preserve">Closing Script</w:t>
+      </w:r>
+    </w:p>
+    <w:p>
+      <w:pPr>
+        <w:pBdr>
+          <w:left w:val="single" w:color="002B49" w:sz="8"/>
+        </w:pBdr>
+        <w:shd w:fill="F0F9FF" w:color="auto" w:val="clear"/>
+        <w:spacing w:after="80" w:before="80"/>
+        <w:ind w:left="480"/>
+      </w:pPr>
+      <w:r>
+        <w:rPr>
+          <w:rFonts w:ascii="Cambria" w:cs="Cambria" w:eastAsia="Cambria" w:hAnsi="Cambria"/>
+          <w:color w:val="002B49"/>
+          <w:sz w:val="24"/>
+          <w:szCs w:val="24"/>
+        </w:rPr>
+        <w:t xml:space="preserve">“Based on everything you\u2019ve shared, I believe [Package Name] is the best fit.”</w:t>
+      </w:r>
+    </w:p>
+    <w:p>
+      <w:r>
+        <w:t xml:space="preserve"/>
+      </w:r>
+    </w:p>
+    <w:p>
+      <w:pPr>
+        <w:pBdr>
+          <w:left w:val="single" w:color="002B49" w:sz="8"/>
+        </w:pBdr>
+        <w:shd w:fill="F0F9FF" w:color="auto" w:val="clear"/>
+        <w:spacing w:after="80" w:before="80"/>
+        <w:ind w:left="480"/>
+      </w:pPr>
+      <w:r>
+        <w:rPr>
+          <w:rFonts w:ascii="Cambria" w:cs="Cambria" w:eastAsia="Cambria" w:hAnsi="Cambria"/>
+          <w:color w:val="002B49"/>
+          <w:sz w:val="24"/>
+          <w:szCs w:val="24"/>
+        </w:rPr>
+        <w:t xml:space="preserve">“The investment is [Price].”</w:t>
+      </w:r>
+    </w:p>
+    <w:p>
+      <w:r>
+        <w:t xml:space="preserve"/>
+      </w:r>
+    </w:p>
+    <w:p>
+      <w:pPr>
+        <w:pBdr>
+          <w:left w:val="single" w:color="002B49" w:sz="8"/>
+        </w:pBdr>
+        <w:shd w:fill="F0F9FF" w:color="auto" w:val="clear"/>
+        <w:spacing w:after="80" w:before="80"/>
+        <w:ind w:left="480"/>
+      </w:pPr>
+      <w:r>
+        <w:rPr>
+          <w:rFonts w:ascii="Cambria" w:cs="Cambria" w:eastAsia="Cambria" w:hAnsi="Cambria"/>
+          <w:color w:val="002B49"/>
+          <w:sz w:val="24"/>
+          <w:szCs w:val="24"/>
+        </w:rPr>
+        <w:t xml:space="preserve">“We can get started immediately once payment is received. Would you like me to send the proposal and next steps?”</w:t>
+      </w:r>
+    </w:p>
+    <w:p>
+      <w:r>
+        <w:t xml:space="preserve"/>
+      </w:r>
+    </w:p>
+    <w:p>
+      <w:pPr>
+        <w:pStyle w:val="Heading2"/>
+      </w:pPr>
+      <w:r>
+        <w:t xml:space="preserve">Free Health Check Script</w:t>
+      </w:r>
+    </w:p>
+    <w:p>
+      <w:pPr>
+        <w:pBdr>
+          <w:left w:val="single" w:color="002B49" w:sz="8"/>
+        </w:pBdr>
+        <w:shd w:fill="F0F9FF" w:color="auto" w:val="clear"/>
+        <w:spacing w:after="80" w:before="80"/>
+        <w:ind w:left="480"/>
+      </w:pPr>
+      <w:r>
+        <w:rPr>
+          <w:rFonts w:ascii="Cambria" w:cs="Cambria" w:eastAsia="Cambria" w:hAnsi="Cambria"/>
+          <w:color w:val="002B49"/>
+          <w:sz w:val="24"/>
+          <w:szCs w:val="24"/>
+        </w:rPr>
+        <w:t xml:space="preserve">“Before we go any further, let me offer you something completely free. It\u2019s a short online form \u2014 takes two minutes \u2014 and it shows you exactly where your business stands online right now. No commitment, no sales pitch. Results come back within 24 hours. Want me to send you the link?”</w:t>
+      </w:r>
+    </w:p>
+    <w:p>
+      <w:pPr>
+        <w:pBdr>
+          <w:left w:val="single" w:color="00C2D8" w:sz="12"/>
+        </w:pBdr>
+        <w:spacing w:after="80" w:before="80"/>
+        <w:ind w:left="480"/>
+      </w:pPr>
+      <w:r>
+        <w:rPr>
+          <w:rFonts w:ascii="Cambria" w:cs="Cambria" w:eastAsia="Cambria" w:hAnsi="Cambria"/>
+          <w:i/>
+          <w:iCs/>
+          <w:color w:val="003d5c"/>
+          <w:sz w:val="22"/>
+          <w:szCs w:val="22"/>
+        </w:rPr>
         <w:t xml:space="preserve">Health Check link: bluwavgrowth.com/free-health-check</w:t>
       </w:r>
     </w:p>
@@ -3141,503 +4004,1131 @@
         <w:pageBreakBefore/>
       </w:pPr>
       <w:r>
-        <w:t xml:space="preserve">Section 6 — Objection Handler</w:t>
-      </w:r>
-    </w:p>
-    <w:tbl>
-      <w:tblPr>
-        <w:tblW w:type="auto" w:w="100"/>
-        <w:tblBorders>
-          <w:top w:val="none" w:color="FFFFFF" w:sz="0"/>
-          <w:left w:val="none" w:color="FFFFFF" w:sz="0"/>
-          <w:bottom w:val="none" w:color="FFFFFF" w:sz="0"/>
-          <w:right w:val="none" w:color="FFFFFF" w:sz="0"/>
-          <w:insideH w:val="single" w:color="auto" w:sz="4"/>
-          <w:insideV w:val="single" w:color="auto" w:sz="4"/>
-        </w:tblBorders>
-        <w:tblCellMar>
-          <w:top w:type="dxa" w:w="80"/>
-          <w:left w:type="dxa" w:w="120"/>
-          <w:bottom w:type="dxa" w:w="80"/>
-          <w:right w:type="dxa" w:w="120"/>
-        </w:tblCellMar>
-      </w:tblPr>
-      <w:tblGrid>
-        <w:gridCol w:w="2800"/>
-        <w:gridCol w:w="6560"/>
-      </w:tblGrid>
-      <w:tr>
-        <w:trPr>
-          <w:tblHeader/>
-        </w:trPr>
-        <w:tc>
-          <w:tcPr>
-            <w:tcW w:type="dxa" w:w="2800"/>
-            <w:tcBorders>
-              <w:top w:val="none" w:color="FFFFFF" w:sz="0"/>
-              <w:left w:val="none" w:color="FFFFFF" w:sz="0"/>
-              <w:bottom w:val="single" w:color="002B49" w:sz="6"/>
-              <w:right w:val="none" w:color="FFFFFF" w:sz="0"/>
-            </w:tcBorders>
-            <w:shd w:fill="EBF5FB" w:color="auto" w:val="clear"/>
-          </w:tcPr>
-          <w:p>
-            <w:r>
-              <w:rPr>
-                <w:rFonts w:ascii="Cambria" w:cs="Cambria" w:eastAsia="Cambria" w:hAnsi="Cambria"/>
-                <w:b/>
-                <w:bCs/>
-                <w:color w:val="002B49"/>
-                <w:sz w:val="22"/>
-                <w:szCs w:val="22"/>
-              </w:rPr>
-              <w:t xml:space="preserve">Objection</w:t>
-            </w:r>
-          </w:p>
-        </w:tc>
-        <w:tc>
-          <w:tcPr>
-            <w:tcW w:type="dxa" w:w="6560"/>
-            <w:tcBorders>
-              <w:top w:val="none" w:color="FFFFFF" w:sz="0"/>
-              <w:left w:val="none" w:color="FFFFFF" w:sz="0"/>
-              <w:bottom w:val="single" w:color="002B49" w:sz="6"/>
-              <w:right w:val="none" w:color="FFFFFF" w:sz="0"/>
-            </w:tcBorders>
-            <w:shd w:fill="EBF5FB" w:color="auto" w:val="clear"/>
-          </w:tcPr>
-          <w:p>
-            <w:r>
-              <w:rPr>
-                <w:rFonts w:ascii="Cambria" w:cs="Cambria" w:eastAsia="Cambria" w:hAnsi="Cambria"/>
-                <w:b/>
-                <w:bCs/>
-                <w:color w:val="002B49"/>
-                <w:sz w:val="22"/>
-                <w:szCs w:val="22"/>
-              </w:rPr>
-              <w:t xml:space="preserve">Your Response</w:t>
-            </w:r>
-          </w:p>
-        </w:tc>
-      </w:tr>
-      <w:tr>
-        <w:tc>
-          <w:tcPr>
-            <w:tcW w:type="dxa" w:w="2800"/>
-            <w:tcBorders>
-              <w:top w:val="none" w:color="FFFFFF" w:sz="0"/>
-              <w:left w:val="none" w:color="FFFFFF" w:sz="0"/>
-              <w:bottom w:val="none" w:color="FFFFFF" w:sz="0"/>
-              <w:right w:val="none" w:color="FFFFFF" w:sz="0"/>
-            </w:tcBorders>
-            <w:shd w:fill="FFFFFF" w:color="auto" w:val="clear"/>
-          </w:tcPr>
-          <w:p>
-            <w:r>
-              <w:rPr>
-                <w:rFonts w:ascii="Cambria" w:cs="Cambria" w:eastAsia="Cambria" w:hAnsi="Cambria"/>
-                <w:b/>
-                <w:bCs/>
-                <w:color w:val="002B49"/>
-                <w:sz w:val="21"/>
-                <w:szCs w:val="21"/>
-              </w:rPr>
-              <w:t xml:space="preserve">“It is too expensive.”</w:t>
-            </w:r>
-          </w:p>
-        </w:tc>
-        <w:tc>
-          <w:tcPr>
-            <w:tcW w:type="dxa" w:w="6560"/>
-            <w:tcBorders>
-              <w:top w:val="none" w:color="FFFFFF" w:sz="0"/>
-              <w:left w:val="none" w:color="FFFFFF" w:sz="0"/>
-              <w:bottom w:val="none" w:color="FFFFFF" w:sz="0"/>
-              <w:right w:val="none" w:color="FFFFFF" w:sz="0"/>
-            </w:tcBorders>
-            <w:shd w:fill="FFFFFF" w:color="auto" w:val="clear"/>
-          </w:tcPr>
-          <w:p>
-            <w:r>
-              <w:rPr>
-                <w:rFonts w:ascii="Cambria" w:cs="Cambria" w:eastAsia="Cambria" w:hAnsi="Cambria"/>
-                <w:b w:val="false"/>
-                <w:bCs w:val="false"/>
-                <w:color w:val="374151"/>
-                <w:sz w:val="21"/>
-                <w:szCs w:val="21"/>
-              </w:rPr>
-              <w:t xml:space="preserve">“I understand. Let me put it in perspective. A professional website alone costs $3,000 to $8,000 at most agencies and takes 6 to 12 weeks. With BluWav, you get the website, Google setup, WhatsApp integration, and a CRM trial — all in 48 hours, starting at $397/month. You are not paying more; you are getting more, faster.”</w:t>
-            </w:r>
-          </w:p>
-        </w:tc>
-      </w:tr>
-      <w:tr>
-        <w:tc>
-          <w:tcPr>
-            <w:tcW w:type="dxa" w:w="2800"/>
-            <w:tcBorders>
-              <w:top w:val="none" w:color="FFFFFF" w:sz="0"/>
-              <w:left w:val="none" w:color="FFFFFF" w:sz="0"/>
-              <w:bottom w:val="none" w:color="FFFFFF" w:sz="0"/>
-              <w:right w:val="none" w:color="FFFFFF" w:sz="0"/>
-            </w:tcBorders>
-            <w:shd w:fill="F8FBFF" w:color="auto" w:val="clear"/>
-          </w:tcPr>
-          <w:p>
-            <w:r>
-              <w:rPr>
-                <w:rFonts w:ascii="Cambria" w:cs="Cambria" w:eastAsia="Cambria" w:hAnsi="Cambria"/>
-                <w:b/>
-                <w:bCs/>
-                <w:color w:val="002B49"/>
-                <w:sz w:val="21"/>
-                <w:szCs w:val="21"/>
-              </w:rPr>
-              <w:t xml:space="preserve">“I can get a website cheaper elsewhere.”</w:t>
-            </w:r>
-          </w:p>
-        </w:tc>
-        <w:tc>
-          <w:tcPr>
-            <w:tcW w:type="dxa" w:w="6560"/>
-            <w:tcBorders>
-              <w:top w:val="none" w:color="FFFFFF" w:sz="0"/>
-              <w:left w:val="none" w:color="FFFFFF" w:sz="0"/>
-              <w:bottom w:val="none" w:color="FFFFFF" w:sz="0"/>
-              <w:right w:val="none" w:color="FFFFFF" w:sz="0"/>
-            </w:tcBorders>
-            <w:shd w:fill="F8FBFF" w:color="auto" w:val="clear"/>
-          </w:tcPr>
-          <w:p>
-            <w:r>
-              <w:rPr>
-                <w:rFonts w:ascii="Cambria" w:cs="Cambria" w:eastAsia="Cambria" w:hAnsi="Cambria"/>
-                <w:b w:val="false"/>
-                <w:bCs w:val="false"/>
-                <w:color w:val="374151"/>
-                <w:sz w:val="21"/>
-                <w:szCs w:val="21"/>
-              </w:rPr>
-              <w:t xml:space="preserve">“You can. But a website on its own does not grow your business. BluWav builds the full system: the website, the Google visibility, the WhatsApp setup, and the CRM. A cheaper website is just a page on the internet. Our system is what turns visitors into customers.”</w:t>
-            </w:r>
-          </w:p>
-        </w:tc>
-      </w:tr>
-      <w:tr>
-        <w:tc>
-          <w:tcPr>
-            <w:tcW w:type="dxa" w:w="2800"/>
-            <w:tcBorders>
-              <w:top w:val="none" w:color="FFFFFF" w:sz="0"/>
-              <w:left w:val="none" w:color="FFFFFF" w:sz="0"/>
-              <w:bottom w:val="none" w:color="FFFFFF" w:sz="0"/>
-              <w:right w:val="none" w:color="FFFFFF" w:sz="0"/>
-            </w:tcBorders>
-            <w:shd w:fill="FFFFFF" w:color="auto" w:val="clear"/>
-          </w:tcPr>
-          <w:p>
-            <w:r>
-              <w:rPr>
-                <w:rFonts w:ascii="Cambria" w:cs="Cambria" w:eastAsia="Cambria" w:hAnsi="Cambria"/>
-                <w:b/>
-                <w:bCs/>
-                <w:color w:val="002B49"/>
-                <w:sz w:val="21"/>
-                <w:szCs w:val="21"/>
-              </w:rPr>
-              <w:t xml:space="preserve">“I need to think about it.”</w:t>
-            </w:r>
-          </w:p>
-        </w:tc>
-        <w:tc>
-          <w:tcPr>
-            <w:tcW w:type="dxa" w:w="6560"/>
-            <w:tcBorders>
-              <w:top w:val="none" w:color="FFFFFF" w:sz="0"/>
-              <w:left w:val="none" w:color="FFFFFF" w:sz="0"/>
-              <w:bottom w:val="none" w:color="FFFFFF" w:sz="0"/>
-              <w:right w:val="none" w:color="FFFFFF" w:sz="0"/>
-            </w:tcBorders>
-            <w:shd w:fill="FFFFFF" w:color="auto" w:val="clear"/>
-          </w:tcPr>
-          <w:p>
-            <w:r>
-              <w:rPr>
-                <w:rFonts w:ascii="Cambria" w:cs="Cambria" w:eastAsia="Cambria" w:hAnsi="Cambria"/>
-                <w:b w:val="false"/>
-                <w:bCs w:val="false"/>
-                <w:color w:val="374151"/>
-                <w:sz w:val="21"/>
-                <w:szCs w:val="21"/>
-              </w:rPr>
-              <w:t xml:space="preserve">“Of course. What specifically would help you make the decision? Is it the investment, the timeline, or understanding exactly what you get? I want to make sure you have everything you need.”</w:t>
-            </w:r>
-          </w:p>
-        </w:tc>
-      </w:tr>
-      <w:tr>
-        <w:tc>
-          <w:tcPr>
-            <w:tcW w:type="dxa" w:w="2800"/>
-            <w:tcBorders>
-              <w:top w:val="none" w:color="FFFFFF" w:sz="0"/>
-              <w:left w:val="none" w:color="FFFFFF" w:sz="0"/>
-              <w:bottom w:val="none" w:color="FFFFFF" w:sz="0"/>
-              <w:right w:val="none" w:color="FFFFFF" w:sz="0"/>
-            </w:tcBorders>
-            <w:shd w:fill="F8FBFF" w:color="auto" w:val="clear"/>
-          </w:tcPr>
-          <w:p>
-            <w:r>
-              <w:rPr>
-                <w:rFonts w:ascii="Cambria" w:cs="Cambria" w:eastAsia="Cambria" w:hAnsi="Cambria"/>
-                <w:b/>
-                <w:bCs/>
-                <w:color w:val="002B49"/>
-                <w:sz w:val="21"/>
-                <w:szCs w:val="21"/>
-              </w:rPr>
-              <w:t xml:space="preserve">“I already have a website.”</w:t>
-            </w:r>
-          </w:p>
-        </w:tc>
-        <w:tc>
-          <w:tcPr>
-            <w:tcW w:type="dxa" w:w="6560"/>
-            <w:tcBorders>
-              <w:top w:val="none" w:color="FFFFFF" w:sz="0"/>
-              <w:left w:val="none" w:color="FFFFFF" w:sz="0"/>
-              <w:bottom w:val="none" w:color="FFFFFF" w:sz="0"/>
-              <w:right w:val="none" w:color="FFFFFF" w:sz="0"/>
-            </w:tcBorders>
-            <w:shd w:fill="F8FBFF" w:color="auto" w:val="clear"/>
-          </w:tcPr>
-          <w:p>
-            <w:r>
-              <w:rPr>
-                <w:rFonts w:ascii="Cambria" w:cs="Cambria" w:eastAsia="Cambria" w:hAnsi="Cambria"/>
-                <w:b w:val="false"/>
-                <w:bCs w:val="false"/>
-                <w:color w:val="374151"/>
-                <w:sz w:val="21"/>
-                <w:szCs w:val="21"/>
-              </w:rPr>
-              <w:t xml:space="preserve">“Great. Is it showing up on Google when customers search for you? Is it capturing leads automatically? Is it connected to a CRM? Most websites we see are not doing any of those things. That is what we fix.”</w:t>
-            </w:r>
-          </w:p>
-        </w:tc>
-      </w:tr>
-      <w:tr>
-        <w:tc>
-          <w:tcPr>
-            <w:tcW w:type="dxa" w:w="2800"/>
-            <w:tcBorders>
-              <w:top w:val="none" w:color="FFFFFF" w:sz="0"/>
-              <w:left w:val="none" w:color="FFFFFF" w:sz="0"/>
-              <w:bottom w:val="none" w:color="FFFFFF" w:sz="0"/>
-              <w:right w:val="none" w:color="FFFFFF" w:sz="0"/>
-            </w:tcBorders>
-            <w:shd w:fill="FFFFFF" w:color="auto" w:val="clear"/>
-          </w:tcPr>
-          <w:p>
-            <w:r>
-              <w:rPr>
-                <w:rFonts w:ascii="Cambria" w:cs="Cambria" w:eastAsia="Cambria" w:hAnsi="Cambria"/>
-                <w:b/>
-                <w:bCs/>
-                <w:color w:val="002B49"/>
-                <w:sz w:val="21"/>
-                <w:szCs w:val="21"/>
-              </w:rPr>
-              <w:t xml:space="preserve">“I am not ready yet.”</w:t>
-            </w:r>
-          </w:p>
-        </w:tc>
-        <w:tc>
-          <w:tcPr>
-            <w:tcW w:type="dxa" w:w="6560"/>
-            <w:tcBorders>
-              <w:top w:val="none" w:color="FFFFFF" w:sz="0"/>
-              <w:left w:val="none" w:color="FFFFFF" w:sz="0"/>
-              <w:bottom w:val="none" w:color="FFFFFF" w:sz="0"/>
-              <w:right w:val="none" w:color="FFFFFF" w:sz="0"/>
-            </w:tcBorders>
-            <w:shd w:fill="FFFFFF" w:color="auto" w:val="clear"/>
-          </w:tcPr>
-          <w:p>
-            <w:r>
-              <w:rPr>
-                <w:rFonts w:ascii="Cambria" w:cs="Cambria" w:eastAsia="Cambria" w:hAnsi="Cambria"/>
-                <w:b w:val="false"/>
-                <w:bCs w:val="false"/>
-                <w:color w:val="374151"/>
-                <w:sz w:val="21"/>
-                <w:szCs w:val="21"/>
-              </w:rPr>
-              <w:t xml:space="preserve">“I hear that a lot. Can I ask: what would need to change for you to be ready? Because every day you are not online, a competitor is winning the customer that should have been yours. Our free Digital Health Check takes 2 minutes and shows you exactly where you stand — no commitment.”</w:t>
-            </w:r>
-          </w:p>
-        </w:tc>
-      </w:tr>
-      <w:tr>
-        <w:tc>
-          <w:tcPr>
-            <w:tcW w:type="dxa" w:w="2800"/>
-            <w:tcBorders>
-              <w:top w:val="none" w:color="FFFFFF" w:sz="0"/>
-              <w:left w:val="none" w:color="FFFFFF" w:sz="0"/>
-              <w:bottom w:val="none" w:color="FFFFFF" w:sz="0"/>
-              <w:right w:val="none" w:color="FFFFFF" w:sz="0"/>
-            </w:tcBorders>
-            <w:shd w:fill="F8FBFF" w:color="auto" w:val="clear"/>
-          </w:tcPr>
-          <w:p>
-            <w:r>
-              <w:rPr>
-                <w:rFonts w:ascii="Cambria" w:cs="Cambria" w:eastAsia="Cambria" w:hAnsi="Cambria"/>
-                <w:b/>
-                <w:bCs/>
-                <w:color w:val="002B49"/>
-                <w:sz w:val="21"/>
-                <w:szCs w:val="21"/>
-              </w:rPr>
-              <w:t xml:space="preserve">“I do not need a CRM.”</w:t>
-            </w:r>
-          </w:p>
-        </w:tc>
-        <w:tc>
-          <w:tcPr>
-            <w:tcW w:type="dxa" w:w="6560"/>
-            <w:tcBorders>
-              <w:top w:val="none" w:color="FFFFFF" w:sz="0"/>
-              <w:left w:val="none" w:color="FFFFFF" w:sz="0"/>
-              <w:bottom w:val="none" w:color="FFFFFF" w:sz="0"/>
-              <w:right w:val="none" w:color="FFFFFF" w:sz="0"/>
-            </w:tcBorders>
-            <w:shd w:fill="F8FBFF" w:color="auto" w:val="clear"/>
-          </w:tcPr>
-          <w:p>
-            <w:r>
-              <w:rPr>
-                <w:rFonts w:ascii="Cambria" w:cs="Cambria" w:eastAsia="Cambria" w:hAnsi="Cambria"/>
-                <w:b w:val="false"/>
-                <w:bCs w:val="false"/>
-                <w:color w:val="374151"/>
-                <w:sz w:val="21"/>
-                <w:szCs w:val="21"/>
-              </w:rPr>
-              <w:t xml:space="preserve">“Most business owners say that until they see how many leads they are losing. The CRM is not a complicated system; it is the engine that connects everything. Every lead from your website, every WhatsApp message, every referral — tracked in one place. And the 14-day trial is free.”</w:t>
-            </w:r>
-          </w:p>
-        </w:tc>
-      </w:tr>
-      <w:tr>
-        <w:tc>
-          <w:tcPr>
-            <w:tcW w:type="dxa" w:w="2800"/>
-            <w:tcBorders>
-              <w:top w:val="none" w:color="FFFFFF" w:sz="0"/>
-              <w:left w:val="none" w:color="FFFFFF" w:sz="0"/>
-              <w:bottom w:val="none" w:color="FFFFFF" w:sz="0"/>
-              <w:right w:val="none" w:color="FFFFFF" w:sz="0"/>
-            </w:tcBorders>
-            <w:shd w:fill="FFFFFF" w:color="auto" w:val="clear"/>
-          </w:tcPr>
-          <w:p>
-            <w:r>
-              <w:rPr>
-                <w:rFonts w:ascii="Cambria" w:cs="Cambria" w:eastAsia="Cambria" w:hAnsi="Cambria"/>
-                <w:b/>
-                <w:bCs/>
-                <w:color w:val="002B49"/>
-                <w:sz w:val="21"/>
-                <w:szCs w:val="21"/>
-              </w:rPr>
-              <w:t xml:space="preserve">“We tried digital marketing before and it didn’t work.”</w:t>
-            </w:r>
-          </w:p>
-        </w:tc>
-        <w:tc>
-          <w:tcPr>
-            <w:tcW w:type="dxa" w:w="6560"/>
-            <w:tcBorders>
-              <w:top w:val="none" w:color="FFFFFF" w:sz="0"/>
-              <w:left w:val="none" w:color="FFFFFF" w:sz="0"/>
-              <w:bottom w:val="none" w:color="FFFFFF" w:sz="0"/>
-              <w:right w:val="none" w:color="FFFFFF" w:sz="0"/>
-            </w:tcBorders>
-            <w:shd w:fill="FFFFFF" w:color="auto" w:val="clear"/>
-          </w:tcPr>
-          <w:p>
-            <w:r>
-              <w:rPr>
-                <w:rFonts w:ascii="Cambria" w:cs="Cambria" w:eastAsia="Cambria" w:hAnsi="Cambria"/>
-                <w:b w:val="false"/>
-                <w:bCs w:val="false"/>
-                <w:color w:val="374151"/>
-                <w:sz w:val="21"/>
-                <w:szCs w:val="21"/>
-              </w:rPr>
-              <w:t xml:space="preserve">“I’m sorry to hear that. Can I ask what happened? [Listen] What BluWav does differently is bring everything into one connected system — website, Google, WhatsApp, CRM — so nothing falls through the cracks. The free Health Check is a great way to see exactly where the gaps are, with no commitment.”</w:t>
-            </w:r>
-          </w:p>
-        </w:tc>
-      </w:tr>
-      <w:tr>
-        <w:tc>
-          <w:tcPr>
-            <w:tcW w:type="dxa" w:w="2800"/>
-            <w:tcBorders>
-              <w:top w:val="none" w:color="FFFFFF" w:sz="0"/>
-              <w:left w:val="none" w:color="FFFFFF" w:sz="0"/>
-              <w:bottom w:val="none" w:color="FFFFFF" w:sz="0"/>
-              <w:right w:val="none" w:color="FFFFFF" w:sz="0"/>
-            </w:tcBorders>
-            <w:shd w:fill="F8FBFF" w:color="auto" w:val="clear"/>
-          </w:tcPr>
-          <w:p>
-            <w:r>
-              <w:rPr>
-                <w:rFonts w:ascii="Cambria" w:cs="Cambria" w:eastAsia="Cambria" w:hAnsi="Cambria"/>
-                <w:b/>
-                <w:bCs/>
-                <w:color w:val="002B49"/>
-                <w:sz w:val="21"/>
-                <w:szCs w:val="21"/>
-              </w:rPr>
-              <w:t xml:space="preserve">“We’re a small business, we don’t need all this.”</w:t>
-            </w:r>
-          </w:p>
-        </w:tc>
-        <w:tc>
-          <w:tcPr>
-            <w:tcW w:type="dxa" w:w="6560"/>
-            <w:tcBorders>
-              <w:top w:val="none" w:color="FFFFFF" w:sz="0"/>
-              <w:left w:val="none" w:color="FFFFFF" w:sz="0"/>
-              <w:bottom w:val="none" w:color="FFFFFF" w:sz="0"/>
-              <w:right w:val="none" w:color="FFFFFF" w:sz="0"/>
-            </w:tcBorders>
-            <w:shd w:fill="F8FBFF" w:color="auto" w:val="clear"/>
-          </w:tcPr>
-          <w:p>
-            <w:r>
-              <w:rPr>
-                <w:rFonts w:ascii="Cambria" w:cs="Cambria" w:eastAsia="Cambria" w:hAnsi="Cambria"/>
-                <w:b w:val="false"/>
-                <w:bCs w:val="false"/>
-                <w:color w:val="374151"/>
-                <w:sz w:val="21"/>
-                <w:szCs w:val="21"/>
-              </w:rPr>
-              <w:t xml:space="preserve">“That’s exactly who BluWav is built for. Our Launch™ plan starts at $397/month — you own everything we build, forever, and it includes a 14-day free CRM trial. The Health Check just shows you where the biggest opportunity is for your specific business. No commitment.”</w:t>
-            </w:r>
-          </w:p>
-        </w:tc>
-      </w:tr>
-    </w:tbl>
+        <w:t xml:space="preserve">Section 6 \u2014 Objection Handler (Expanded)</w:t>
+      </w:r>
+    </w:p>
+    <w:p>
+      <w:r>
+        <w:rPr>
+          <w:rFonts w:ascii="Cambria" w:cs="Cambria" w:eastAsia="Cambria" w:hAnsi="Cambria"/>
+          <w:color w:val="1E1E1E"/>
+          <w:sz w:val="24"/>
+          <w:szCs w:val="24"/>
+        </w:rPr>
+        <w:t xml:space="preserve">Objections are not rejections. They are requests for more information or reassurance. Acknowledge, respond, and redirect.</w:t>
+      </w:r>
+    </w:p>
+    <w:p>
+      <w:r>
+        <w:t xml:space="preserve"/>
+      </w:r>
+    </w:p>
+    <w:p>
+      <w:pPr>
+        <w:pStyle w:val="Heading2"/>
+      </w:pPr>
+      <w:r>
+        <w:t xml:space="preserve">\u201cIt\u2019s too expensive.\u201d</w:t>
+      </w:r>
+    </w:p>
+    <w:p>
+      <w:pPr>
+        <w:pBdr>
+          <w:left w:val="single" w:color="002B49" w:sz="8"/>
+        </w:pBdr>
+        <w:shd w:fill="F0F9FF" w:color="auto" w:val="clear"/>
+        <w:spacing w:after="80" w:before="80"/>
+        <w:ind w:left="480"/>
+      </w:pPr>
+      <w:r>
+        <w:rPr>
+          <w:rFonts w:ascii="Cambria" w:cs="Cambria" w:eastAsia="Cambria" w:hAnsi="Cambria"/>
+          <w:color w:val="002B49"/>
+          <w:sz w:val="24"/>
+          <w:szCs w:val="24"/>
+        </w:rPr>
+        <w:t xml:space="preserve">“I understand. Compared to what? A website? A marketing agency? Hiring staff?”</w:t>
+      </w:r>
+    </w:p>
+    <w:p>
+      <w:pPr>
+        <w:pBdr>
+          <w:left w:val="single" w:color="002B49" w:sz="8"/>
+        </w:pBdr>
+        <w:shd w:fill="F0F9FF" w:color="auto" w:val="clear"/>
+        <w:spacing w:after="80" w:before="80"/>
+        <w:ind w:left="480"/>
+      </w:pPr>
+      <w:r>
+        <w:rPr>
+          <w:rFonts w:ascii="Cambria" w:cs="Cambria" w:eastAsia="Cambria" w:hAnsi="Cambria"/>
+          <w:color w:val="002B49"/>
+          <w:sz w:val="24"/>
+          <w:szCs w:val="24"/>
+        </w:rPr>
+        <w:t xml:space="preserve">“BluWav isn\u2019t a website package. It\u2019s a growth system designed to help your business get found, get chosen, and grow. The question isn\u2019t the monthly investment. The question is what missed opportunities are costing you today.”</w:t>
+      </w:r>
+    </w:p>
+    <w:p>
+      <w:r>
+        <w:t xml:space="preserve"/>
+      </w:r>
+    </w:p>
+    <w:p>
+      <w:pPr>
+        <w:pStyle w:val="Heading2"/>
+      </w:pPr>
+      <w:r>
+        <w:t xml:space="preserve">\u201cI can get a cheaper website.\u201d</w:t>
+      </w:r>
+    </w:p>
+    <w:p>
+      <w:pPr>
+        <w:pBdr>
+          <w:left w:val="single" w:color="002B49" w:sz="8"/>
+        </w:pBdr>
+        <w:shd w:fill="F0F9FF" w:color="auto" w:val="clear"/>
+        <w:spacing w:after="80" w:before="80"/>
+        <w:ind w:left="480"/>
+      </w:pPr>
+      <w:r>
+        <w:rPr>
+          <w:rFonts w:ascii="Cambria" w:cs="Cambria" w:eastAsia="Cambria" w:hAnsi="Cambria"/>
+          <w:color w:val="002B49"/>
+          <w:sz w:val="24"/>
+          <w:szCs w:val="24"/>
+        </w:rPr>
+        <w:t xml:space="preserve">“You absolutely can.”</w:t>
+      </w:r>
+    </w:p>
+    <w:p>
+      <w:pPr>
+        <w:pBdr>
+          <w:left w:val="single" w:color="002B49" w:sz="8"/>
+        </w:pBdr>
+        <w:shd w:fill="F0F9FF" w:color="auto" w:val="clear"/>
+        <w:spacing w:after="80" w:before="80"/>
+        <w:ind w:left="480"/>
+      </w:pPr>
+      <w:r>
+        <w:rPr>
+          <w:rFonts w:ascii="Cambria" w:cs="Cambria" w:eastAsia="Cambria" w:hAnsi="Cambria"/>
+          <w:color w:val="002B49"/>
+          <w:sz w:val="24"/>
+          <w:szCs w:val="24"/>
+        </w:rPr>
+        <w:t xml:space="preserve">“But websites don\u2019t generate growth by themselves. The real question is whether that website includes Google visibility, automation, lead capture, WhatsApp integration, reporting, and CRM connectivity.”</w:t>
+      </w:r>
+    </w:p>
+    <w:p>
+      <w:pPr>
+        <w:pBdr>
+          <w:left w:val="single" w:color="002B49" w:sz="8"/>
+        </w:pBdr>
+        <w:shd w:fill="F0F9FF" w:color="auto" w:val="clear"/>
+        <w:spacing w:after="80" w:before="80"/>
+        <w:ind w:left="480"/>
+      </w:pPr>
+      <w:r>
+        <w:rPr>
+          <w:rFonts w:ascii="Cambria" w:cs="Cambria" w:eastAsia="Cambria" w:hAnsi="Cambria"/>
+          <w:color w:val="002B49"/>
+          <w:sz w:val="24"/>
+          <w:szCs w:val="24"/>
+        </w:rPr>
+        <w:t xml:space="preserve">“Most don\u2019t. That\u2019s the difference.”</w:t>
+      </w:r>
+    </w:p>
+    <w:p>
+      <w:r>
+        <w:t xml:space="preserve"/>
+      </w:r>
+    </w:p>
+    <w:p>
+      <w:pPr>
+        <w:pStyle w:val="Heading2"/>
+      </w:pPr>
+      <w:r>
+        <w:t xml:space="preserve">\u201cI already have a website.\u201d</w:t>
+      </w:r>
+    </w:p>
+    <w:p>
+      <w:pPr>
+        <w:pBdr>
+          <w:left w:val="single" w:color="002B49" w:sz="8"/>
+        </w:pBdr>
+        <w:shd w:fill="F0F9FF" w:color="auto" w:val="clear"/>
+        <w:spacing w:after="80" w:before="80"/>
+        <w:ind w:left="480"/>
+      </w:pPr>
+      <w:r>
+        <w:rPr>
+          <w:rFonts w:ascii="Cambria" w:cs="Cambria" w:eastAsia="Cambria" w:hAnsi="Cambria"/>
+          <w:color w:val="002B49"/>
+          <w:sz w:val="24"/>
+          <w:szCs w:val="24"/>
+        </w:rPr>
+        <w:t xml:space="preserve">“That\u2019s great.”</w:t>
+      </w:r>
+    </w:p>
+    <w:p>
+      <w:pPr>
+        <w:pBdr>
+          <w:left w:val="single" w:color="002B49" w:sz="8"/>
+        </w:pBdr>
+        <w:shd w:fill="F0F9FF" w:color="auto" w:val="clear"/>
+        <w:spacing w:after="80" w:before="80"/>
+        <w:ind w:left="480"/>
+      </w:pPr>
+      <w:r>
+        <w:rPr>
+          <w:rFonts w:ascii="Cambria" w:cs="Cambria" w:eastAsia="Cambria" w:hAnsi="Cambria"/>
+          <w:color w:val="002B49"/>
+          <w:sz w:val="24"/>
+          <w:szCs w:val="24"/>
+        </w:rPr>
+        <w:t xml:space="preserve">“How many leads did it generate last month?”</w:t>
+      </w:r>
+    </w:p>
+    <w:p>
+      <w:pPr>
+        <w:pBdr>
+          <w:left w:val="single" w:color="002B49" w:sz="8"/>
+        </w:pBdr>
+        <w:shd w:fill="F0F9FF" w:color="auto" w:val="clear"/>
+        <w:spacing w:after="80" w:before="80"/>
+        <w:ind w:left="480"/>
+      </w:pPr>
+      <w:r>
+        <w:rPr>
+          <w:rFonts w:ascii="Cambria" w:cs="Cambria" w:eastAsia="Cambria" w:hAnsi="Cambria"/>
+          <w:color w:val="002B49"/>
+          <w:sz w:val="24"/>
+          <w:szCs w:val="24"/>
+        </w:rPr>
+        <w:t xml:space="preserve">“Is it connected to a CRM?”</w:t>
+      </w:r>
+    </w:p>
+    <w:p>
+      <w:pPr>
+        <w:pBdr>
+          <w:left w:val="single" w:color="002B49" w:sz="8"/>
+        </w:pBdr>
+        <w:shd w:fill="F0F9FF" w:color="auto" w:val="clear"/>
+        <w:spacing w:after="80" w:before="80"/>
+        <w:ind w:left="480"/>
+      </w:pPr>
+      <w:r>
+        <w:rPr>
+          <w:rFonts w:ascii="Cambria" w:cs="Cambria" w:eastAsia="Cambria" w:hAnsi="Cambria"/>
+          <w:color w:val="002B49"/>
+          <w:sz w:val="24"/>
+          <w:szCs w:val="24"/>
+        </w:rPr>
+        <w:t xml:space="preserve">“Does it automatically follow up?”</w:t>
+      </w:r>
+    </w:p>
+    <w:p>
+      <w:pPr>
+        <w:pBdr>
+          <w:left w:val="single" w:color="002B49" w:sz="8"/>
+        </w:pBdr>
+        <w:shd w:fill="F0F9FF" w:color="auto" w:val="clear"/>
+        <w:spacing w:after="80" w:before="80"/>
+        <w:ind w:left="480"/>
+      </w:pPr>
+      <w:r>
+        <w:rPr>
+          <w:rFonts w:ascii="Cambria" w:cs="Cambria" w:eastAsia="Cambria" w:hAnsi="Cambria"/>
+          <w:color w:val="002B49"/>
+          <w:sz w:val="24"/>
+          <w:szCs w:val="24"/>
+        </w:rPr>
+        <w:t xml:space="preserve">“Is it ranking in local search?”</w:t>
+      </w:r>
+    </w:p>
+    <w:p>
+      <w:pPr>
+        <w:pBdr>
+          <w:left w:val="single" w:color="002B49" w:sz="8"/>
+        </w:pBdr>
+        <w:shd w:fill="F0F9FF" w:color="auto" w:val="clear"/>
+        <w:spacing w:after="80" w:before="80"/>
+        <w:ind w:left="480"/>
+      </w:pPr>
+      <w:r>
+        <w:rPr>
+          <w:rFonts w:ascii="Cambria" w:cs="Cambria" w:eastAsia="Cambria" w:hAnsi="Cambria"/>
+          <w:color w:val="002B49"/>
+          <w:sz w:val="24"/>
+          <w:szCs w:val="24"/>
+        </w:rPr>
+        <w:t xml:space="preserve">“Most business owners discover they don\u2019t actually need another website. They need a better growth system.”</w:t>
+      </w:r>
+    </w:p>
+    <w:p>
+      <w:r>
+        <w:t xml:space="preserve"/>
+      </w:r>
+    </w:p>
+    <w:p>
+      <w:pPr>
+        <w:pStyle w:val="Heading2"/>
+      </w:pPr>
+      <w:r>
+        <w:t xml:space="preserve">\u201cI already have a CRM.\u201d</w:t>
+      </w:r>
+    </w:p>
+    <w:p>
+      <w:pPr>
+        <w:pBdr>
+          <w:left w:val="single" w:color="002B49" w:sz="8"/>
+        </w:pBdr>
+        <w:shd w:fill="F0F9FF" w:color="auto" w:val="clear"/>
+        <w:spacing w:after="80" w:before="80"/>
+        <w:ind w:left="480"/>
+      </w:pPr>
+      <w:r>
+        <w:rPr>
+          <w:rFonts w:ascii="Cambria" w:cs="Cambria" w:eastAsia="Cambria" w:hAnsi="Cambria"/>
+          <w:color w:val="002B49"/>
+          <w:sz w:val="24"/>
+          <w:szCs w:val="24"/>
+        </w:rPr>
+        <w:t xml:space="preserve">“Excellent. What are you using?”</w:t>
+      </w:r>
+    </w:p>
+    <w:p>
+      <w:pPr>
+        <w:pBdr>
+          <w:left w:val="single" w:color="002B49" w:sz="8"/>
+        </w:pBdr>
+        <w:shd w:fill="F0F9FF" w:color="auto" w:val="clear"/>
+        <w:spacing w:after="80" w:before="80"/>
+        <w:ind w:left="480"/>
+      </w:pPr>
+      <w:r>
+        <w:rPr>
+          <w:rFonts w:ascii="Cambria" w:cs="Cambria" w:eastAsia="Cambria" w:hAnsi="Cambria"/>
+          <w:color w:val="002B49"/>
+          <w:sz w:val="24"/>
+          <w:szCs w:val="24"/>
+        </w:rPr>
+        <w:t xml:space="preserve">“Are your team members actively using it?”</w:t>
+      </w:r>
+    </w:p>
+    <w:p>
+      <w:pPr>
+        <w:pBdr>
+          <w:left w:val="single" w:color="002B49" w:sz="8"/>
+        </w:pBdr>
+        <w:shd w:fill="F0F9FF" w:color="auto" w:val="clear"/>
+        <w:spacing w:after="80" w:before="80"/>
+        <w:ind w:left="480"/>
+      </w:pPr>
+      <w:r>
+        <w:rPr>
+          <w:rFonts w:ascii="Cambria" w:cs="Cambria" w:eastAsia="Cambria" w:hAnsi="Cambria"/>
+          <w:color w:val="002B49"/>
+          <w:sz w:val="24"/>
+          <w:szCs w:val="24"/>
+        </w:rPr>
+        <w:t xml:space="preserve">“Is it connected to your website, WhatsApp, and lead sources?”</w:t>
+      </w:r>
+    </w:p>
+    <w:p>
+      <w:pPr>
+        <w:pBdr>
+          <w:left w:val="single" w:color="002B49" w:sz="8"/>
+        </w:pBdr>
+        <w:shd w:fill="F0F9FF" w:color="auto" w:val="clear"/>
+        <w:spacing w:after="80" w:before="80"/>
+        <w:ind w:left="480"/>
+      </w:pPr>
+      <w:r>
+        <w:rPr>
+          <w:rFonts w:ascii="Cambria" w:cs="Cambria" w:eastAsia="Cambria" w:hAnsi="Cambria"/>
+          <w:color w:val="002B49"/>
+          <w:sz w:val="24"/>
+          <w:szCs w:val="24"/>
+        </w:rPr>
+        <w:t xml:space="preserve">“If your current CRM is doing everything you need, we\u2019ll tell you. But many clients come to us because the CRM isn\u2019t being fully used.”</w:t>
+      </w:r>
+    </w:p>
+    <w:p>
+      <w:r>
+        <w:t xml:space="preserve"/>
+      </w:r>
+    </w:p>
+    <w:p>
+      <w:pPr>
+        <w:pStyle w:val="Heading2"/>
+      </w:pPr>
+      <w:r>
+        <w:t xml:space="preserve">\u201cWe\u2019re too small.\u201d</w:t>
+      </w:r>
+    </w:p>
+    <w:p>
+      <w:pPr>
+        <w:pBdr>
+          <w:left w:val="single" w:color="002B49" w:sz="8"/>
+        </w:pBdr>
+        <w:shd w:fill="F0F9FF" w:color="auto" w:val="clear"/>
+        <w:spacing w:after="80" w:before="80"/>
+        <w:ind w:left="480"/>
+      </w:pPr>
+      <w:r>
+        <w:rPr>
+          <w:rFonts w:ascii="Cambria" w:cs="Cambria" w:eastAsia="Cambria" w:hAnsi="Cambria"/>
+          <w:color w:val="002B49"/>
+          <w:sz w:val="24"/>
+          <w:szCs w:val="24"/>
+        </w:rPr>
+        <w:t xml:space="preserve">“Launch™ was designed specifically for businesses in that situation.”</w:t>
+      </w:r>
+    </w:p>
+    <w:p>
+      <w:pPr>
+        <w:pBdr>
+          <w:left w:val="single" w:color="002B49" w:sz="8"/>
+        </w:pBdr>
+        <w:shd w:fill="F0F9FF" w:color="auto" w:val="clear"/>
+        <w:spacing w:after="80" w:before="80"/>
+        <w:ind w:left="480"/>
+      </w:pPr>
+      <w:r>
+        <w:rPr>
+          <w:rFonts w:ascii="Cambria" w:cs="Cambria" w:eastAsia="Cambria" w:hAnsi="Cambria"/>
+          <w:color w:val="002B49"/>
+          <w:sz w:val="24"/>
+          <w:szCs w:val="24"/>
+        </w:rPr>
+        <w:t xml:space="preserve">“Small businesses need systems even more because every missed lead hurts.”</w:t>
+      </w:r>
+    </w:p>
+    <w:p>
+      <w:pPr>
+        <w:pBdr>
+          <w:left w:val="single" w:color="002B49" w:sz="8"/>
+        </w:pBdr>
+        <w:shd w:fill="F0F9FF" w:color="auto" w:val="clear"/>
+        <w:spacing w:after="80" w:before="80"/>
+        <w:ind w:left="480"/>
+      </w:pPr>
+      <w:r>
+        <w:rPr>
+          <w:rFonts w:ascii="Cambria" w:cs="Cambria" w:eastAsia="Cambria" w:hAnsi="Cambria"/>
+          <w:color w:val="002B49"/>
+          <w:sz w:val="24"/>
+          <w:szCs w:val="24"/>
+        </w:rPr>
+        <w:t xml:space="preserve">“The earlier you build the foundation, the easier growth becomes.”</w:t>
+      </w:r>
+    </w:p>
+    <w:p>
+      <w:r>
+        <w:t xml:space="preserve"/>
+      </w:r>
+    </w:p>
+    <w:p>
+      <w:pPr>
+        <w:pStyle w:val="Heading2"/>
+      </w:pPr>
+      <w:r>
+        <w:t xml:space="preserve">\u201cWe\u2019re too busy.\u201d</w:t>
+      </w:r>
+    </w:p>
+    <w:p>
+      <w:pPr>
+        <w:pBdr>
+          <w:left w:val="single" w:color="002B49" w:sz="8"/>
+        </w:pBdr>
+        <w:shd w:fill="F0F9FF" w:color="auto" w:val="clear"/>
+        <w:spacing w:after="80" w:before="80"/>
+        <w:ind w:left="480"/>
+      </w:pPr>
+      <w:r>
+        <w:rPr>
+          <w:rFonts w:ascii="Cambria" w:cs="Cambria" w:eastAsia="Cambria" w:hAnsi="Cambria"/>
+          <w:color w:val="002B49"/>
+          <w:sz w:val="24"/>
+          <w:szCs w:val="24"/>
+        </w:rPr>
+        <w:t xml:space="preserve">“That\u2019s usually a sign that better systems are needed.”</w:t>
+      </w:r>
+    </w:p>
+    <w:p>
+      <w:pPr>
+        <w:pBdr>
+          <w:left w:val="single" w:color="002B49" w:sz="8"/>
+        </w:pBdr>
+        <w:shd w:fill="F0F9FF" w:color="auto" w:val="clear"/>
+        <w:spacing w:after="80" w:before="80"/>
+        <w:ind w:left="480"/>
+      </w:pPr>
+      <w:r>
+        <w:rPr>
+          <w:rFonts w:ascii="Cambria" w:cs="Cambria" w:eastAsia="Cambria" w:hAnsi="Cambria"/>
+          <w:color w:val="002B49"/>
+          <w:sz w:val="24"/>
+          <w:szCs w:val="24"/>
+        </w:rPr>
+        <w:t xml:space="preserve">“Most business owners aren\u2019t too busy because they have too many customers. They\u2019re too busy because too many things depend on them personally.”</w:t>
+      </w:r>
+    </w:p>
+    <w:p>
+      <w:pPr>
+        <w:pBdr>
+          <w:left w:val="single" w:color="002B49" w:sz="8"/>
+        </w:pBdr>
+        <w:shd w:fill="F0F9FF" w:color="auto" w:val="clear"/>
+        <w:spacing w:after="80" w:before="80"/>
+        <w:ind w:left="480"/>
+      </w:pPr>
+      <w:r>
+        <w:rPr>
+          <w:rFonts w:ascii="Cambria" w:cs="Cambria" w:eastAsia="Cambria" w:hAnsi="Cambria"/>
+          <w:color w:val="002B49"/>
+          <w:sz w:val="24"/>
+          <w:szCs w:val="24"/>
+        </w:rPr>
+        <w:t xml:space="preserve">“That\u2019s exactly what automation helps solve.”</w:t>
+      </w:r>
+    </w:p>
+    <w:p>
+      <w:r>
+        <w:t xml:space="preserve"/>
+      </w:r>
+    </w:p>
+    <w:p>
+      <w:pPr>
+        <w:pStyle w:val="Heading2"/>
+      </w:pPr>
+      <w:r>
+        <w:t xml:space="preserve">\u201cWe\u2019ve tried marketing before.\u201d</w:t>
+      </w:r>
+    </w:p>
+    <w:p>
+      <w:pPr>
+        <w:pBdr>
+          <w:left w:val="single" w:color="002B49" w:sz="8"/>
+        </w:pBdr>
+        <w:shd w:fill="F0F9FF" w:color="auto" w:val="clear"/>
+        <w:spacing w:after="80" w:before="80"/>
+        <w:ind w:left="480"/>
+      </w:pPr>
+      <w:r>
+        <w:rPr>
+          <w:rFonts w:ascii="Cambria" w:cs="Cambria" w:eastAsia="Cambria" w:hAnsi="Cambria"/>
+          <w:color w:val="002B49"/>
+          <w:sz w:val="24"/>
+          <w:szCs w:val="24"/>
+        </w:rPr>
+        <w:t xml:space="preserve">“I hear that often.”</w:t>
+      </w:r>
+    </w:p>
+    <w:p>
+      <w:pPr>
+        <w:pBdr>
+          <w:left w:val="single" w:color="002B49" w:sz="8"/>
+        </w:pBdr>
+        <w:shd w:fill="F0F9FF" w:color="auto" w:val="clear"/>
+        <w:spacing w:after="80" w:before="80"/>
+        <w:ind w:left="480"/>
+      </w:pPr>
+      <w:r>
+        <w:rPr>
+          <w:rFonts w:ascii="Cambria" w:cs="Cambria" w:eastAsia="Cambria" w:hAnsi="Cambria"/>
+          <w:color w:val="002B49"/>
+          <w:sz w:val="24"/>
+          <w:szCs w:val="24"/>
+        </w:rPr>
+        <w:t xml:space="preserve">“Can I ask what happened?”</w:t>
+      </w:r>
+    </w:p>
+    <w:p>
+      <w:pPr>
+        <w:pBdr>
+          <w:left w:val="single" w:color="00C2D8" w:sz="12"/>
+        </w:pBdr>
+        <w:spacing w:after="80" w:before="80"/>
+        <w:ind w:left="480"/>
+      </w:pPr>
+      <w:r>
+        <w:rPr>
+          <w:rFonts w:ascii="Cambria" w:cs="Cambria" w:eastAsia="Cambria" w:hAnsi="Cambria"/>
+          <w:i/>
+          <w:iCs/>
+          <w:color w:val="003d5c"/>
+          <w:sz w:val="22"/>
+          <w:szCs w:val="22"/>
+        </w:rPr>
+        <w:t xml:space="preserve">Listen.</w:t>
+      </w:r>
+    </w:p>
+    <w:p>
+      <w:pPr>
+        <w:pBdr>
+          <w:left w:val="single" w:color="002B49" w:sz="8"/>
+        </w:pBdr>
+        <w:shd w:fill="F0F9FF" w:color="auto" w:val="clear"/>
+        <w:spacing w:after="80" w:before="80"/>
+        <w:ind w:left="480"/>
+      </w:pPr>
+      <w:r>
+        <w:rPr>
+          <w:rFonts w:ascii="Cambria" w:cs="Cambria" w:eastAsia="Cambria" w:hAnsi="Cambria"/>
+          <w:color w:val="002B49"/>
+          <w:sz w:val="24"/>
+          <w:szCs w:val="24"/>
+        </w:rPr>
+        <w:t xml:space="preserve">“Most marketing problems aren\u2019t actually marketing problems. They\u2019re system problems.”</w:t>
+      </w:r>
+    </w:p>
+    <w:p>
+      <w:pPr>
+        <w:pBdr>
+          <w:left w:val="single" w:color="002B49" w:sz="8"/>
+        </w:pBdr>
+        <w:shd w:fill="F0F9FF" w:color="auto" w:val="clear"/>
+        <w:spacing w:after="80" w:before="80"/>
+        <w:ind w:left="480"/>
+      </w:pPr>
+      <w:r>
+        <w:rPr>
+          <w:rFonts w:ascii="Cambria" w:cs="Cambria" w:eastAsia="Cambria" w:hAnsi="Cambria"/>
+          <w:color w:val="002B49"/>
+          <w:sz w:val="24"/>
+          <w:szCs w:val="24"/>
+        </w:rPr>
+        <w:t xml:space="preserve">“Traffic without follow-up doesn\u2019t work. Leads without a process don\u2019t work. That\u2019s why BluWav connects everything.”</w:t>
+      </w:r>
+    </w:p>
+    <w:p>
+      <w:r>
+        <w:t xml:space="preserve"/>
+      </w:r>
+    </w:p>
+    <w:p>
+      <w:pPr>
+        <w:pStyle w:val="Heading2"/>
+      </w:pPr>
+      <w:r>
+        <w:t xml:space="preserve">\u201cSend me some information.\u201d</w:t>
+      </w:r>
+    </w:p>
+    <w:p>
+      <w:pPr>
+        <w:pBdr>
+          <w:left w:val="single" w:color="002B49" w:sz="8"/>
+        </w:pBdr>
+        <w:shd w:fill="F0F9FF" w:color="auto" w:val="clear"/>
+        <w:spacing w:after="80" w:before="80"/>
+        <w:ind w:left="480"/>
+      </w:pPr>
+      <w:r>
+        <w:rPr>
+          <w:rFonts w:ascii="Cambria" w:cs="Cambria" w:eastAsia="Cambria" w:hAnsi="Cambria"/>
+          <w:color w:val="002B49"/>
+          <w:sz w:val="24"/>
+          <w:szCs w:val="24"/>
+        </w:rPr>
+        <w:t xml:space="preserve">“I\u2019d be happy to.”</w:t>
+      </w:r>
+    </w:p>
+    <w:p>
+      <w:pPr>
+        <w:pBdr>
+          <w:left w:val="single" w:color="002B49" w:sz="8"/>
+        </w:pBdr>
+        <w:shd w:fill="F0F9FF" w:color="auto" w:val="clear"/>
+        <w:spacing w:after="80" w:before="80"/>
+        <w:ind w:left="480"/>
+      </w:pPr>
+      <w:r>
+        <w:rPr>
+          <w:rFonts w:ascii="Cambria" w:cs="Cambria" w:eastAsia="Cambria" w:hAnsi="Cambria"/>
+          <w:color w:val="002B49"/>
+          <w:sz w:val="24"/>
+          <w:szCs w:val="24"/>
+        </w:rPr>
+        <w:t xml:space="preserve">“Before I do, what specifically would you like information about?”</w:t>
+      </w:r>
+    </w:p>
+    <w:p>
+      <w:pPr>
+        <w:pBdr>
+          <w:left w:val="single" w:color="00C2D8" w:sz="12"/>
+        </w:pBdr>
+        <w:spacing w:after="80" w:before="80"/>
+        <w:ind w:left="480"/>
+      </w:pPr>
+      <w:r>
+        <w:rPr>
+          <w:rFonts w:ascii="Cambria" w:cs="Cambria" w:eastAsia="Cambria" w:hAnsi="Cambria"/>
+          <w:i/>
+          <w:iCs/>
+          <w:color w:val="003d5c"/>
+          <w:sz w:val="22"/>
+          <w:szCs w:val="22"/>
+        </w:rPr>
+        <w:t xml:space="preserve">That keeps the conversation open rather than ending it.</w:t>
+      </w:r>
+    </w:p>
+    <w:p>
+      <w:r>
+        <w:t xml:space="preserve"/>
+      </w:r>
+    </w:p>
+    <w:p>
+      <w:pPr>
+        <w:pStyle w:val="Heading2"/>
+      </w:pPr>
+      <w:r>
+        <w:t xml:space="preserve">\u201cI need to talk to my partner/spouse/team.\u201d</w:t>
+      </w:r>
+    </w:p>
+    <w:p>
+      <w:pPr>
+        <w:pBdr>
+          <w:left w:val="single" w:color="002B49" w:sz="8"/>
+        </w:pBdr>
+        <w:shd w:fill="F0F9FF" w:color="auto" w:val="clear"/>
+        <w:spacing w:after="80" w:before="80"/>
+        <w:ind w:left="480"/>
+      </w:pPr>
+      <w:r>
+        <w:rPr>
+          <w:rFonts w:ascii="Cambria" w:cs="Cambria" w:eastAsia="Cambria" w:hAnsi="Cambria"/>
+          <w:color w:val="002B49"/>
+          <w:sz w:val="24"/>
+          <w:szCs w:val="24"/>
+        </w:rPr>
+        <w:t xml:space="preserve">“Absolutely.”</w:t>
+      </w:r>
+    </w:p>
+    <w:p>
+      <w:pPr>
+        <w:pBdr>
+          <w:left w:val="single" w:color="002B49" w:sz="8"/>
+        </w:pBdr>
+        <w:shd w:fill="F0F9FF" w:color="auto" w:val="clear"/>
+        <w:spacing w:after="80" w:before="80"/>
+        <w:ind w:left="480"/>
+      </w:pPr>
+      <w:r>
+        <w:rPr>
+          <w:rFonts w:ascii="Cambria" w:cs="Cambria" w:eastAsia="Cambria" w:hAnsi="Cambria"/>
+          <w:color w:val="002B49"/>
+          <w:sz w:val="24"/>
+          <w:szCs w:val="24"/>
+        </w:rPr>
+        <w:t xml:space="preserve">“What questions do you think they\u2019ll ask?”</w:t>
+      </w:r>
+    </w:p>
+    <w:p>
+      <w:pPr>
+        <w:pBdr>
+          <w:left w:val="single" w:color="002B49" w:sz="8"/>
+        </w:pBdr>
+        <w:shd w:fill="F0F9FF" w:color="auto" w:val="clear"/>
+        <w:spacing w:after="80" w:before="80"/>
+        <w:ind w:left="480"/>
+      </w:pPr>
+      <w:r>
+        <w:rPr>
+          <w:rFonts w:ascii="Cambria" w:cs="Cambria" w:eastAsia="Cambria" w:hAnsi="Cambria"/>
+          <w:color w:val="002B49"/>
+          <w:sz w:val="24"/>
+          <w:szCs w:val="24"/>
+        </w:rPr>
+        <w:t xml:space="preserve">“Let\u2019s make sure you have those answers before you leave.”</w:t>
+      </w:r>
+    </w:p>
+    <w:p>
+      <w:r>
+        <w:t xml:space="preserve"/>
+      </w:r>
+    </w:p>
+    <w:p>
+      <w:pPr>
+        <w:pStyle w:val="Heading2"/>
+      </w:pPr>
+      <w:r>
+        <w:t xml:space="preserve">\u201cWe\u2019re not ready.\u201d</w:t>
+      </w:r>
+    </w:p>
+    <w:p>
+      <w:pPr>
+        <w:pBdr>
+          <w:left w:val="single" w:color="002B49" w:sz="8"/>
+        </w:pBdr>
+        <w:shd w:fill="F0F9FF" w:color="auto" w:val="clear"/>
+        <w:spacing w:after="80" w:before="80"/>
+        <w:ind w:left="480"/>
+      </w:pPr>
+      <w:r>
+        <w:rPr>
+          <w:rFonts w:ascii="Cambria" w:cs="Cambria" w:eastAsia="Cambria" w:hAnsi="Cambria"/>
+          <w:color w:val="002B49"/>
+          <w:sz w:val="24"/>
+          <w:szCs w:val="24"/>
+        </w:rPr>
+        <w:t xml:space="preserve">“What needs to happen before you\u2019re ready?”</w:t>
+      </w:r>
+    </w:p>
+    <w:p>
+      <w:pPr>
+        <w:pBdr>
+          <w:left w:val="single" w:color="00C2D8" w:sz="12"/>
+        </w:pBdr>
+        <w:spacing w:after="80" w:before="80"/>
+        <w:ind w:left="480"/>
+      </w:pPr>
+      <w:r>
+        <w:rPr>
+          <w:rFonts w:ascii="Cambria" w:cs="Cambria" w:eastAsia="Cambria" w:hAnsi="Cambria"/>
+          <w:i/>
+          <w:iCs/>
+          <w:color w:val="003d5c"/>
+          <w:sz w:val="22"/>
+          <w:szCs w:val="22"/>
+        </w:rPr>
+        <w:t xml:space="preserve">Listen.</w:t>
+      </w:r>
+    </w:p>
+    <w:p>
+      <w:pPr>
+        <w:pBdr>
+          <w:left w:val="single" w:color="002B49" w:sz="8"/>
+        </w:pBdr>
+        <w:shd w:fill="F0F9FF" w:color="auto" w:val="clear"/>
+        <w:spacing w:after="80" w:before="80"/>
+        <w:ind w:left="480"/>
+      </w:pPr>
+      <w:r>
+        <w:rPr>
+          <w:rFonts w:ascii="Cambria" w:cs="Cambria" w:eastAsia="Cambria" w:hAnsi="Cambria"/>
+          <w:color w:val="002B49"/>
+          <w:sz w:val="24"/>
+          <w:szCs w:val="24"/>
+        </w:rPr>
+        <w:t xml:space="preserve">“That\u2019s exactly why many businesses start with the Free Digital Health Check or the 30-Day Growth Sprint. It gives you clarity before making bigger decisions.”</w:t>
+      </w:r>
+    </w:p>
+    <w:p>
+      <w:r>
+        <w:t xml:space="preserve"/>
+      </w:r>
+    </w:p>
+    <w:p>
+      <w:pPr>
+        <w:pStyle w:val="Heading2"/>
+      </w:pPr>
+      <w:r>
+        <w:t xml:space="preserve">\u201cI don\u2019t want a contract.\u201d</w:t>
+      </w:r>
+    </w:p>
+    <w:p>
+      <w:pPr>
+        <w:pBdr>
+          <w:left w:val="single" w:color="002B49" w:sz="8"/>
+        </w:pBdr>
+        <w:shd w:fill="F0F9FF" w:color="auto" w:val="clear"/>
+        <w:spacing w:after="80" w:before="80"/>
+        <w:ind w:left="480"/>
+      </w:pPr>
+      <w:r>
+        <w:rPr>
+          <w:rFonts w:ascii="Cambria" w:cs="Cambria" w:eastAsia="Cambria" w:hAnsi="Cambria"/>
+          <w:color w:val="002B49"/>
+          <w:sz w:val="24"/>
+          <w:szCs w:val="24"/>
+        </w:rPr>
+        <w:t xml:space="preserve">“That\u2019s completely understandable.”</w:t>
+      </w:r>
+    </w:p>
+    <w:p>
+      <w:pPr>
+        <w:pBdr>
+          <w:left w:val="single" w:color="002B49" w:sz="8"/>
+        </w:pBdr>
+        <w:shd w:fill="F0F9FF" w:color="auto" w:val="clear"/>
+        <w:spacing w:after="80" w:before="80"/>
+        <w:ind w:left="480"/>
+      </w:pPr>
+      <w:r>
+        <w:rPr>
+          <w:rFonts w:ascii="Cambria" w:cs="Cambria" w:eastAsia="Cambria" w:hAnsi="Cambria"/>
+          <w:color w:val="002B49"/>
+          <w:sz w:val="24"/>
+          <w:szCs w:val="24"/>
+        </w:rPr>
+        <w:t xml:space="preserve">“The focus is results and partnership. We want clients to stay because they\u2019re seeing value, not because they\u2019re trapped.”</w:t>
+      </w:r>
+    </w:p>
+    <w:p>
+      <w:r>
+        <w:t xml:space="preserve"/>
+      </w:r>
+    </w:p>
+    <w:p>
+      <w:pPr>
+        <w:pStyle w:val="Heading2"/>
+      </w:pPr>
+      <w:r>
+        <w:t xml:space="preserve">\u201cAI will replace all of this.\u201d</w:t>
+      </w:r>
+    </w:p>
+    <w:p>
+      <w:pPr>
+        <w:pBdr>
+          <w:left w:val="single" w:color="002B49" w:sz="8"/>
+        </w:pBdr>
+        <w:shd w:fill="F0F9FF" w:color="auto" w:val="clear"/>
+        <w:spacing w:after="80" w:before="80"/>
+        <w:ind w:left="480"/>
+      </w:pPr>
+      <w:r>
+        <w:rPr>
+          <w:rFonts w:ascii="Cambria" w:cs="Cambria" w:eastAsia="Cambria" w:hAnsi="Cambria"/>
+          <w:color w:val="002B49"/>
+          <w:sz w:val="24"/>
+          <w:szCs w:val="24"/>
+        </w:rPr>
+        <w:t xml:space="preserve">“AI is a powerful tool, but tools still need strategy, systems, and execution.”</w:t>
+      </w:r>
+    </w:p>
+    <w:p>
+      <w:pPr>
+        <w:pBdr>
+          <w:left w:val="single" w:color="002B49" w:sz="8"/>
+        </w:pBdr>
+        <w:shd w:fill="F0F9FF" w:color="auto" w:val="clear"/>
+        <w:spacing w:after="80" w:before="80"/>
+        <w:ind w:left="480"/>
+      </w:pPr>
+      <w:r>
+        <w:rPr>
+          <w:rFonts w:ascii="Cambria" w:cs="Cambria" w:eastAsia="Cambria" w:hAnsi="Cambria"/>
+          <w:color w:val="002B49"/>
+          <w:sz w:val="24"/>
+          <w:szCs w:val="24"/>
+        </w:rPr>
+        <w:t xml:space="preserve">“BluWav helps businesses use technology effectively rather than trying to figure everything out themselves.”</w:t>
+      </w:r>
+    </w:p>
+    <w:p>
+      <w:r>
+        <w:t xml:space="preserve"/>
+      </w:r>
+    </w:p>
+    <w:p>
+      <w:pPr>
+        <w:pStyle w:val="Heading2"/>
+      </w:pPr>
+      <w:r>
+        <w:t xml:space="preserve">\u201cCan I just get the CRM?\u201d</w:t>
+      </w:r>
+    </w:p>
+    <w:p>
+      <w:pPr>
+        <w:pBdr>
+          <w:left w:val="single" w:color="002B49" w:sz="8"/>
+        </w:pBdr>
+        <w:shd w:fill="F0F9FF" w:color="auto" w:val="clear"/>
+        <w:spacing w:after="80" w:before="80"/>
+        <w:ind w:left="480"/>
+      </w:pPr>
+      <w:r>
+        <w:rPr>
+          <w:rFonts w:ascii="Cambria" w:cs="Cambria" w:eastAsia="Cambria" w:hAnsi="Cambria"/>
+          <w:color w:val="002B49"/>
+          <w:sz w:val="24"/>
+          <w:szCs w:val="24"/>
+        </w:rPr>
+        <w:t xml:space="preserve">“Absolutely.”</w:t>
+      </w:r>
+    </w:p>
+    <w:p>
+      <w:pPr>
+        <w:pBdr>
+          <w:left w:val="single" w:color="002B49" w:sz="8"/>
+        </w:pBdr>
+        <w:shd w:fill="F0F9FF" w:color="auto" w:val="clear"/>
+        <w:spacing w:after="80" w:before="80"/>
+        <w:ind w:left="480"/>
+      </w:pPr>
+      <w:r>
+        <w:rPr>
+          <w:rFonts w:ascii="Cambria" w:cs="Cambria" w:eastAsia="Cambria" w:hAnsi="Cambria"/>
+          <w:color w:val="002B49"/>
+          <w:sz w:val="24"/>
+          <w:szCs w:val="24"/>
+        </w:rPr>
+        <w:t xml:space="preserve">“But let me ask: how are you generating leads today?”</w:t>
+      </w:r>
+    </w:p>
+    <w:p>
+      <w:pPr>
+        <w:pBdr>
+          <w:left w:val="single" w:color="00C2D8" w:sz="12"/>
+        </w:pBdr>
+        <w:spacing w:after="80" w:before="80"/>
+        <w:ind w:left="480"/>
+      </w:pPr>
+      <w:r>
+        <w:rPr>
+          <w:rFonts w:ascii="Cambria" w:cs="Cambria" w:eastAsia="Cambria" w:hAnsi="Cambria"/>
+          <w:i/>
+          <w:iCs/>
+          <w:color w:val="003d5c"/>
+          <w:sz w:val="22"/>
+          <w:szCs w:val="22"/>
+        </w:rPr>
+        <w:t xml:space="preserve">If lead generation is weak: The CRM can help manage leads, but Growth Systems help create them. That\u2019s why many clients combine both.</w:t>
+      </w:r>
+    </w:p>
+    <w:p>
+      <w:r>
+        <w:t xml:space="preserve"/>
+      </w:r>
+    </w:p>
+    <w:p>
+      <w:pPr>
+        <w:pStyle w:val="Heading2"/>
+      </w:pPr>
+      <w:r>
+        <w:t xml:space="preserve">\u201cCan I just get the website?\u201d</w:t>
+      </w:r>
+    </w:p>
+    <w:p>
+      <w:pPr>
+        <w:pBdr>
+          <w:left w:val="single" w:color="002B49" w:sz="8"/>
+        </w:pBdr>
+        <w:shd w:fill="F0F9FF" w:color="auto" w:val="clear"/>
+        <w:spacing w:after="80" w:before="80"/>
+        <w:ind w:left="480"/>
+      </w:pPr>
+      <w:r>
+        <w:rPr>
+          <w:rFonts w:ascii="Cambria" w:cs="Cambria" w:eastAsia="Cambria" w:hAnsi="Cambria"/>
+          <w:color w:val="002B49"/>
+          <w:sz w:val="24"/>
+          <w:szCs w:val="24"/>
+        </w:rPr>
+        <w:t xml:space="preserve">“You can, but that\u2019s usually not the real problem.”</w:t>
+      </w:r>
+    </w:p>
+    <w:p>
+      <w:pPr>
+        <w:pBdr>
+          <w:left w:val="single" w:color="002B49" w:sz="8"/>
+        </w:pBdr>
+        <w:shd w:fill="F0F9FF" w:color="auto" w:val="clear"/>
+        <w:spacing w:after="80" w:before="80"/>
+        <w:ind w:left="480"/>
+      </w:pPr>
+      <w:r>
+        <w:rPr>
+          <w:rFonts w:ascii="Cambria" w:cs="Cambria" w:eastAsia="Cambria" w:hAnsi="Cambria"/>
+          <w:color w:val="002B49"/>
+          <w:sz w:val="24"/>
+          <w:szCs w:val="24"/>
+        </w:rPr>
+        <w:t xml:space="preserve">“The real problem is being found, being chosen, and following up consistently.”</w:t>
+      </w:r>
+    </w:p>
+    <w:p>
+      <w:pPr>
+        <w:pBdr>
+          <w:left w:val="single" w:color="002B49" w:sz="8"/>
+        </w:pBdr>
+        <w:shd w:fill="F0F9FF" w:color="auto" w:val="clear"/>
+        <w:spacing w:after="80" w:before="80"/>
+        <w:ind w:left="480"/>
+      </w:pPr>
+      <w:r>
+        <w:rPr>
+          <w:rFonts w:ascii="Cambria" w:cs="Cambria" w:eastAsia="Cambria" w:hAnsi="Cambria"/>
+          <w:color w:val="002B49"/>
+          <w:sz w:val="24"/>
+          <w:szCs w:val="24"/>
+        </w:rPr>
+        <w:t xml:space="preserve">“The website is one part of that. BluWav builds the complete system.”</w:t>
+      </w:r>
+    </w:p>
+    <w:p>
+      <w:r>
+        <w:t xml:space="preserve"/>
+      </w:r>
+    </w:p>
+    <w:p>
+      <w:pPr>
+        <w:pStyle w:val="Heading2"/>
+      </w:pPr>
+      <w:r>
+        <w:t xml:space="preserve">\u201cWhat makes BluWav different?\u201d</w:t>
+      </w:r>
+    </w:p>
+    <w:p>
+      <w:pPr>
+        <w:pBdr>
+          <w:left w:val="single" w:color="002B49" w:sz="8"/>
+        </w:pBdr>
+        <w:shd w:fill="F0F9FF" w:color="auto" w:val="clear"/>
+        <w:spacing w:after="80" w:before="80"/>
+        <w:ind w:left="480"/>
+      </w:pPr>
+      <w:r>
+        <w:rPr>
+          <w:rFonts w:ascii="Cambria" w:cs="Cambria" w:eastAsia="Cambria" w:hAnsi="Cambria"/>
+          <w:color w:val="002B49"/>
+          <w:sz w:val="24"/>
+          <w:szCs w:val="24"/>
+        </w:rPr>
+        <w:t xml:space="preserve">“Most companies sell individual services.”</w:t>
+      </w:r>
+    </w:p>
+    <w:p>
+      <w:pPr>
+        <w:pBdr>
+          <w:left w:val="single" w:color="002B49" w:sz="8"/>
+        </w:pBdr>
+        <w:shd w:fill="F0F9FF" w:color="auto" w:val="clear"/>
+        <w:spacing w:after="80" w:before="80"/>
+        <w:ind w:left="480"/>
+      </w:pPr>
+      <w:r>
+        <w:rPr>
+          <w:rFonts w:ascii="Cambria" w:cs="Cambria" w:eastAsia="Cambria" w:hAnsi="Cambria"/>
+          <w:color w:val="002B49"/>
+          <w:sz w:val="24"/>
+          <w:szCs w:val="24"/>
+        </w:rPr>
+        <w:t xml:space="preserve">“Some sell websites. Some sell marketing. Some sell CRM software.”</w:t>
+      </w:r>
+    </w:p>
+    <w:p>
+      <w:pPr>
+        <w:pBdr>
+          <w:left w:val="single" w:color="002B49" w:sz="8"/>
+        </w:pBdr>
+        <w:shd w:fill="F0F9FF" w:color="auto" w:val="clear"/>
+        <w:spacing w:after="80" w:before="80"/>
+        <w:ind w:left="480"/>
+      </w:pPr>
+      <w:r>
+        <w:rPr>
+          <w:rFonts w:ascii="Cambria" w:cs="Cambria" w:eastAsia="Cambria" w:hAnsi="Cambria"/>
+          <w:color w:val="002B49"/>
+          <w:sz w:val="24"/>
+          <w:szCs w:val="24"/>
+        </w:rPr>
+        <w:t xml:space="preserve">“BluWav connects everything into one growth system designed to help businesses get found, get chosen, and grow.”</w:t>
+      </w:r>
+    </w:p>
     <w:p>
       <w:r>
         <w:t xml:space="preserve"/>
@@ -3674,109 +5165,6 @@
       </w:pPr>
       <w:r>
         <w:t xml:space="preserve">Week 1: Learn and Prepare</w:t>
-      </w:r>
-    </w:p>
-    <w:p>
-      <w:pPr>
-        <w:pStyle w:val="ListParagraph"/>
-        <w:numPr>
-          <w:ilvl w:val="0"/>
-          <w:numId w:val="6"/>
-        </w:numPr>
-      </w:pPr>
-      <w:r>
-        <w:rPr>
-          <w:rFonts w:ascii="Cambria" w:cs="Cambria" w:eastAsia="Cambria" w:hAnsi="Cambria"/>
-          <w:color w:val="1E1E1E"/>
-          <w:sz w:val="24"/>
-          <w:szCs w:val="24"/>
-        </w:rPr>
-        <w:t xml:space="preserve">Read this package in full. Know the products, prices, and scripts.</w:t>
-      </w:r>
-    </w:p>
-    <w:p>
-      <w:pPr>
-        <w:pStyle w:val="ListParagraph"/>
-        <w:numPr>
-          <w:ilvl w:val="0"/>
-          <w:numId w:val="6"/>
-        </w:numPr>
-      </w:pPr>
-      <w:r>
-        <w:rPr>
-          <w:rFonts w:ascii="Cambria" w:cs="Cambria" w:eastAsia="Cambria" w:hAnsi="Cambria"/>
-          <w:color w:val="1E1E1E"/>
-          <w:sz w:val="24"/>
-          <w:szCs w:val="24"/>
-        </w:rPr>
-        <w:t xml:space="preserve">Complete your onboarding call with the VP, Sales &amp; Marketing.</w:t>
-      </w:r>
-    </w:p>
-    <w:p>
-      <w:pPr>
-        <w:pStyle w:val="ListParagraph"/>
-        <w:numPr>
-          <w:ilvl w:val="0"/>
-          <w:numId w:val="6"/>
-        </w:numPr>
-      </w:pPr>
-      <w:r>
-        <w:rPr>
-          <w:rFonts w:ascii="Cambria" w:cs="Cambria" w:eastAsia="Cambria" w:hAnsi="Cambria"/>
-          <w:color w:val="1E1E1E"/>
-          <w:sz w:val="24"/>
-          <w:szCs w:val="24"/>
-        </w:rPr>
-        <w:t xml:space="preserve">Access the Agent Portal and run through the Commission Calculator.</w:t>
-      </w:r>
-    </w:p>
-    <w:p>
-      <w:pPr>
-        <w:pStyle w:val="ListParagraph"/>
-        <w:numPr>
-          <w:ilvl w:val="0"/>
-          <w:numId w:val="6"/>
-        </w:numPr>
-      </w:pPr>
-      <w:r>
-        <w:rPr>
-          <w:rFonts w:ascii="Cambria" w:cs="Cambria" w:eastAsia="Cambria" w:hAnsi="Cambria"/>
-          <w:color w:val="1E1E1E"/>
-          <w:sz w:val="24"/>
-          <w:szCs w:val="24"/>
-        </w:rPr>
-        <w:t xml:space="preserve">Identify your first 10 prospects: business owners you know personally or in your network.</w:t>
-      </w:r>
-    </w:p>
-    <w:p>
-      <w:pPr>
-        <w:pStyle w:val="ListParagraph"/>
-        <w:numPr>
-          <w:ilvl w:val="0"/>
-          <w:numId w:val="6"/>
-        </w:numPr>
-      </w:pPr>
-      <w:r>
-        <w:rPr>
-          <w:rFonts w:ascii="Cambria" w:cs="Cambria" w:eastAsia="Cambria" w:hAnsi="Cambria"/>
-          <w:color w:val="1E1E1E"/>
-          <w:sz w:val="24"/>
-          <w:szCs w:val="24"/>
-        </w:rPr>
-        <w:t xml:space="preserve">Practice the opening script out loud until it feels natural.</w:t>
-      </w:r>
-    </w:p>
-    <w:p>
-      <w:r>
-        <w:t xml:space="preserve"/>
-      </w:r>
-    </w:p>
-    <w:p>
-      <w:pPr>
-        <w:pStyle w:val="Heading2"/>
-      </w:pPr>
-      <w:r>
-        <w:t xml:space="preserve">Week 2: First Conversations</w:t>
       </w:r>
     </w:p>
     <w:p>
@@ -3794,7 +5182,7 @@
           <w:sz w:val="24"/>
           <w:szCs w:val="24"/>
         </w:rPr>
-        <w:t xml:space="preserve">Contact your first 10 prospects via email, phone, or in person.</w:t>
+        <w:t xml:space="preserve">Read this package in full. Know the products, prices, and scripts.</w:t>
       </w:r>
     </w:p>
     <w:p>
@@ -3812,7 +5200,7 @@
           <w:sz w:val="24"/>
           <w:szCs w:val="24"/>
         </w:rPr>
-        <w:t xml:space="preserve">Aim for 3 discovery conversations this week.</w:t>
+        <w:t xml:space="preserve">Complete your onboarding call with the VP, Sales &amp; Marketing.</w:t>
       </w:r>
     </w:p>
     <w:p>
@@ -3830,7 +5218,7 @@
           <w:sz w:val="24"/>
           <w:szCs w:val="24"/>
         </w:rPr>
-        <w:t xml:space="preserve">Send the free Digital Health Check link to every prospect: bluwavgrowth.com/free-health-check</w:t>
+        <w:t xml:space="preserve">Access the Agent Portal and run through the Commission Calculator.</w:t>
       </w:r>
     </w:p>
     <w:p>
@@ -3848,7 +5236,25 @@
           <w:sz w:val="24"/>
           <w:szCs w:val="24"/>
         </w:rPr>
-        <w:t xml:space="preserve">Submit any warm leads to the VP, Sales &amp; Marketing immediately.</w:t>
+        <w:t xml:space="preserve">Identify your first 10 prospects: business owners you know personally or in your network.</w:t>
+      </w:r>
+    </w:p>
+    <w:p>
+      <w:pPr>
+        <w:pStyle w:val="ListParagraph"/>
+        <w:numPr>
+          <w:ilvl w:val="0"/>
+          <w:numId w:val="7"/>
+        </w:numPr>
+      </w:pPr>
+      <w:r>
+        <w:rPr>
+          <w:rFonts w:ascii="Cambria" w:cs="Cambria" w:eastAsia="Cambria" w:hAnsi="Cambria"/>
+          <w:color w:val="1E1E1E"/>
+          <w:sz w:val="24"/>
+          <w:szCs w:val="24"/>
+        </w:rPr>
+        <w:t xml:space="preserve">Practice the opening script out loud until it feels natural.</w:t>
       </w:r>
     </w:p>
     <w:p>
@@ -3861,7 +5267,7 @@
         <w:pStyle w:val="Heading2"/>
       </w:pPr>
       <w:r>
-        <w:t xml:space="preserve">Week 3: Follow Up and Close</w:t>
+        <w:t xml:space="preserve">Week 2: First Conversations</w:t>
       </w:r>
     </w:p>
     <w:p>
@@ -3879,7 +5285,7 @@
           <w:sz w:val="24"/>
           <w:szCs w:val="24"/>
         </w:rPr>
-        <w:t xml:space="preserve">Follow up with every prospect from Week 2 who did not respond.</w:t>
+        <w:t xml:space="preserve">Contact your first 10 prospects via email, phone, or in person.</w:t>
       </w:r>
     </w:p>
     <w:p>
@@ -3897,7 +5303,7 @@
           <w:sz w:val="24"/>
           <w:szCs w:val="24"/>
         </w:rPr>
-        <w:t xml:space="preserve">Aim to close your first deal this week.</w:t>
+        <w:t xml:space="preserve">Aim for 3 discovery conversations this week.</w:t>
       </w:r>
     </w:p>
     <w:p>
@@ -3915,7 +5321,7 @@
           <w:sz w:val="24"/>
           <w:szCs w:val="24"/>
         </w:rPr>
-        <w:t xml:space="preserve">Identify 10 more prospects and begin outreach.</w:t>
+        <w:t xml:space="preserve">Send the free Digital Health Check link to every prospect: bluwavgrowth.com/free-health-check</w:t>
       </w:r>
     </w:p>
     <w:p>
@@ -3933,7 +5339,7 @@
           <w:sz w:val="24"/>
           <w:szCs w:val="24"/>
         </w:rPr>
-        <w:t xml:space="preserve">Ask every conversation: “Do you know any other business owners who might need this?”</w:t>
+        <w:t xml:space="preserve">Submit any warm leads to the VP, Sales &amp; Marketing immediately.</w:t>
       </w:r>
     </w:p>
     <w:p>
@@ -3946,7 +5352,7 @@
         <w:pStyle w:val="Heading2"/>
       </w:pPr>
       <w:r>
-        <w:t xml:space="preserve">Week 4: Build Momentum</w:t>
+        <w:t xml:space="preserve">Week 3: Follow Up and Close</w:t>
       </w:r>
     </w:p>
     <w:p>
@@ -3964,7 +5370,7 @@
           <w:sz w:val="24"/>
           <w:szCs w:val="24"/>
         </w:rPr>
-        <w:t xml:space="preserve">Review your pipeline. Who is close to closing? Follow up.</w:t>
+        <w:t xml:space="preserve">Follow up with every prospect from Week 2 who did not respond.</w:t>
       </w:r>
     </w:p>
     <w:p>
@@ -3982,7 +5388,7 @@
           <w:sz w:val="24"/>
           <w:szCs w:val="24"/>
         </w:rPr>
-        <w:t xml:space="preserve">Aim for 3 closed deals by end of Month 1.</w:t>
+        <w:t xml:space="preserve">Aim to close your first deal this week.</w:t>
       </w:r>
     </w:p>
     <w:p>
@@ -4000,7 +5406,7 @@
           <w:sz w:val="24"/>
           <w:szCs w:val="24"/>
         </w:rPr>
-        <w:t xml:space="preserve">Submit your first payout request if you have cleared commissions.</w:t>
+        <w:t xml:space="preserve">Identify 10 more prospects and begin outreach.</w:t>
       </w:r>
     </w:p>
     <w:p>
@@ -4009,6 +5415,91 @@
         <w:numPr>
           <w:ilvl w:val="0"/>
           <w:numId w:val="9"/>
+        </w:numPr>
+      </w:pPr>
+      <w:r>
+        <w:rPr>
+          <w:rFonts w:ascii="Cambria" w:cs="Cambria" w:eastAsia="Cambria" w:hAnsi="Cambria"/>
+          <w:color w:val="1E1E1E"/>
+          <w:sz w:val="24"/>
+          <w:szCs w:val="24"/>
+        </w:rPr>
+        <w:t xml:space="preserve">Ask every conversation: “Do you know any other business owners who might need this?”</w:t>
+      </w:r>
+    </w:p>
+    <w:p>
+      <w:r>
+        <w:t xml:space="preserve"/>
+      </w:r>
+    </w:p>
+    <w:p>
+      <w:pPr>
+        <w:pStyle w:val="Heading2"/>
+      </w:pPr>
+      <w:r>
+        <w:t xml:space="preserve">Week 4: Build Momentum</w:t>
+      </w:r>
+    </w:p>
+    <w:p>
+      <w:pPr>
+        <w:pStyle w:val="ListParagraph"/>
+        <w:numPr>
+          <w:ilvl w:val="0"/>
+          <w:numId w:val="10"/>
+        </w:numPr>
+      </w:pPr>
+      <w:r>
+        <w:rPr>
+          <w:rFonts w:ascii="Cambria" w:cs="Cambria" w:eastAsia="Cambria" w:hAnsi="Cambria"/>
+          <w:color w:val="1E1E1E"/>
+          <w:sz w:val="24"/>
+          <w:szCs w:val="24"/>
+        </w:rPr>
+        <w:t xml:space="preserve">Review your pipeline. Who is close to closing? Follow up.</w:t>
+      </w:r>
+    </w:p>
+    <w:p>
+      <w:pPr>
+        <w:pStyle w:val="ListParagraph"/>
+        <w:numPr>
+          <w:ilvl w:val="0"/>
+          <w:numId w:val="10"/>
+        </w:numPr>
+      </w:pPr>
+      <w:r>
+        <w:rPr>
+          <w:rFonts w:ascii="Cambria" w:cs="Cambria" w:eastAsia="Cambria" w:hAnsi="Cambria"/>
+          <w:color w:val="1E1E1E"/>
+          <w:sz w:val="24"/>
+          <w:szCs w:val="24"/>
+        </w:rPr>
+        <w:t xml:space="preserve">Aim for 3 closed deals by end of Month 1.</w:t>
+      </w:r>
+    </w:p>
+    <w:p>
+      <w:pPr>
+        <w:pStyle w:val="ListParagraph"/>
+        <w:numPr>
+          <w:ilvl w:val="0"/>
+          <w:numId w:val="10"/>
+        </w:numPr>
+      </w:pPr>
+      <w:r>
+        <w:rPr>
+          <w:rFonts w:ascii="Cambria" w:cs="Cambria" w:eastAsia="Cambria" w:hAnsi="Cambria"/>
+          <w:color w:val="1E1E1E"/>
+          <w:sz w:val="24"/>
+          <w:szCs w:val="24"/>
+        </w:rPr>
+        <w:t xml:space="preserve">Submit your first payout request if you have cleared commissions.</w:t>
+      </w:r>
+    </w:p>
+    <w:p>
+      <w:pPr>
+        <w:pStyle w:val="ListParagraph"/>
+        <w:numPr>
+          <w:ilvl w:val="0"/>
+          <w:numId w:val="10"/>
         </w:numPr>
       </w:pPr>
       <w:r>
@@ -4757,7 +6248,7 @@
         <w:pStyle w:val="ListParagraph"/>
         <w:numPr>
           <w:ilvl w:val="0"/>
-          <w:numId w:val="10"/>
+          <w:numId w:val="6"/>
         </w:numPr>
       </w:pPr>
       <w:r>
@@ -4775,7 +6266,7 @@
         <w:pStyle w:val="ListParagraph"/>
         <w:numPr>
           <w:ilvl w:val="0"/>
-          <w:numId w:val="10"/>
+          <w:numId w:val="6"/>
         </w:numPr>
       </w:pPr>
       <w:r>
@@ -4793,7 +6284,7 @@
         <w:pStyle w:val="ListParagraph"/>
         <w:numPr>
           <w:ilvl w:val="0"/>
-          <w:numId w:val="10"/>
+          <w:numId w:val="6"/>
         </w:numPr>
       </w:pPr>
       <w:r>
@@ -4811,7 +6302,7 @@
         <w:pStyle w:val="ListParagraph"/>
         <w:numPr>
           <w:ilvl w:val="0"/>
-          <w:numId w:val="10"/>
+          <w:numId w:val="6"/>
         </w:numPr>
       </w:pPr>
       <w:r>
@@ -4829,7 +6320,7 @@
         <w:pStyle w:val="ListParagraph"/>
         <w:numPr>
           <w:ilvl w:val="0"/>
-          <w:numId w:val="10"/>
+          <w:numId w:val="6"/>
         </w:numPr>
       </w:pPr>
       <w:r>
@@ -5635,31 +7126,31 @@
     </w:lvlOverride>
   </w:num>
   <w:num w:numId="6">
+    <w:abstractNumId w:val="10"/>
+    <w:lvlOverride w:ilvl="0">
+      <w:startOverride w:val="1"/>
+    </w:lvlOverride>
+  </w:num>
+  <w:num w:numId="7">
     <w:abstractNumId w:val="3"/>
     <w:lvlOverride w:ilvl="0">
       <w:startOverride w:val="1"/>
     </w:lvlOverride>
   </w:num>
-  <w:num w:numId="7">
+  <w:num w:numId="8">
     <w:abstractNumId w:val="5"/>
     <w:lvlOverride w:ilvl="0">
       <w:startOverride w:val="1"/>
     </w:lvlOverride>
   </w:num>
-  <w:num w:numId="8">
+  <w:num w:numId="9">
     <w:abstractNumId w:val="7"/>
     <w:lvlOverride w:ilvl="0">
       <w:startOverride w:val="1"/>
     </w:lvlOverride>
   </w:num>
-  <w:num w:numId="9">
+  <w:num w:numId="10">
     <w:abstractNumId w:val="9"/>
-    <w:lvlOverride w:ilvl="0">
-      <w:startOverride w:val="1"/>
-    </w:lvlOverride>
-  </w:num>
-  <w:num w:numId="10">
-    <w:abstractNumId w:val="10"/>
     <w:lvlOverride w:ilvl="0">
       <w:startOverride w:val="1"/>
     </w:lvlOverride>

</xml_diff>